<commit_message>
modified comments et al
</commit_message>
<xml_diff>
--- a/4.writeup/Reviewers.docx
+++ b/4.writeup/Reviewers.docx
@@ -94,6 +94,61 @@
         <w:t>My biggest concern is the relevance of the DGP chosen. It is unclear to me how the authors came up with eq (6). As the choice of the DGP would affect the results, there should be some discussion on the justification of this choice.</w:t>
       </w:r>
     </w:p>
+    <w:p>
+      <w:pPr>
+        <w:rPr>
+          <w:color w:val="45B0E1" w:themeColor="accent1" w:themeTint="99"/>
+        </w:rPr>
+      </w:pPr>
+      <w:r>
+        <w:rPr>
+          <w:color w:val="45B0E1" w:themeColor="accent1" w:themeTint="99"/>
+        </w:rPr>
+        <w:t xml:space="preserve">Thanks. In line with other </w:t>
+      </w:r>
+      <w:proofErr w:type="gramStart"/>
+      <w:r>
+        <w:rPr>
+          <w:color w:val="45B0E1" w:themeColor="accent1" w:themeTint="99"/>
+        </w:rPr>
+        <w:t>comments</w:t>
+      </w:r>
+      <w:proofErr w:type="gramEnd"/>
+      <w:r>
+        <w:rPr>
+          <w:color w:val="45B0E1" w:themeColor="accent1" w:themeTint="99"/>
+        </w:rPr>
+        <w:t xml:space="preserve"> we’ve modified the DGP so we can add results from a different DGP. We’ve also added some results based on real world data. We’ve taken the Mexican </w:t>
+      </w:r>
+      <w:proofErr w:type="spellStart"/>
+      <w:r>
+        <w:rPr>
+          <w:color w:val="45B0E1" w:themeColor="accent1" w:themeTint="99"/>
+        </w:rPr>
+        <w:t>intercensus</w:t>
+      </w:r>
+      <w:proofErr w:type="spellEnd"/>
+      <w:r>
+        <w:rPr>
+          <w:color w:val="45B0E1" w:themeColor="accent1" w:themeTint="99"/>
+        </w:rPr>
+        <w:t xml:space="preserve"> survey as detailed in Corral et al. (2021) and applied different errors (normal, </w:t>
+      </w:r>
+      <w:proofErr w:type="spellStart"/>
+      <w:r>
+        <w:rPr>
+          <w:color w:val="45B0E1" w:themeColor="accent1" w:themeTint="99"/>
+        </w:rPr>
+        <w:t>non normal</w:t>
+      </w:r>
+      <w:proofErr w:type="spellEnd"/>
+      <w:r>
+        <w:rPr>
+          <w:color w:val="45B0E1" w:themeColor="accent1" w:themeTint="99"/>
+        </w:rPr>
+        <w:t>, heteroskedastic) to the linear portion of the model to further emphasize some of the results. We understand that these additions are not exhaustive, and will clarify as such in the document, but they do lend further credence to the findings.</w:t>
+      </w:r>
+    </w:p>
     <w:p/>
     <w:p>
       <w:r>
@@ -108,6 +163,19 @@
         <w:t xml:space="preserve"> is applicable to a wide range of contexts where survey-to-survey imputation is used. While the conclusions the authors draw in this paper are not unreasonable, the logical connection between the simulation results and the conclusions in Section 5 is weak.</w:t>
       </w:r>
     </w:p>
+    <w:p>
+      <w:pPr>
+        <w:rPr>
+          <w:color w:val="45B0E1" w:themeColor="accent1" w:themeTint="99"/>
+        </w:rPr>
+      </w:pPr>
+      <w:r>
+        <w:rPr>
+          <w:color w:val="45B0E1" w:themeColor="accent1" w:themeTint="99"/>
+        </w:rPr>
+        <w:t>Thank you, we will adjust the conclusions.</w:t>
+      </w:r>
+    </w:p>
     <w:p/>
     <w:p>
       <w:r>
@@ -119,7 +187,11 @@
       </w:r>
       <w:proofErr w:type="gramEnd"/>
       <w:r>
-        <w:t xml:space="preserve"> the seven recommendations in Section 5 are generic and can be derived without the extensive simulations conducted in the paper. The paper would be much more valuable if the simulations </w:t>
+        <w:t xml:space="preserve"> the seven recommendations in Section 5 are generic and can be derived without the extensive simulations conducted in the paper. The paper would be much more </w:t>
+      </w:r>
+      <w:r>
+        <w:lastRenderedPageBreak/>
+        <w:t xml:space="preserve">valuable if the simulations </w:t>
       </w:r>
       <w:proofErr w:type="gramStart"/>
       <w:r>
@@ -130,6 +202,33 @@
         <w:t xml:space="preserve"> done in a more realistic context and identify a set of particularly important pitfalls.</w:t>
       </w:r>
     </w:p>
+    <w:p>
+      <w:pPr>
+        <w:rPr>
+          <w:color w:val="45B0E1" w:themeColor="accent1" w:themeTint="99"/>
+        </w:rPr>
+      </w:pPr>
+      <w:r>
+        <w:rPr>
+          <w:color w:val="45B0E1" w:themeColor="accent1" w:themeTint="99"/>
+        </w:rPr>
+        <w:t xml:space="preserve">Thank you. We have added real world data simulations to the paper. Despite the simplicity of the simulations illustrated, we feel that illustrating how under the model’s underlying assumptions these predictions may easily fail raises considerable questions on the method’s validity as applied in some scenarios. When applied to real world data and bringing in an additional component of changes across time, there are many things that are changing and could lead to the identified biases cancelling out or even compounding. Given the fact that these methods are applied when the true point estimates are unavailable, it is impossible for people to know if the biases have </w:t>
+      </w:r>
+      <w:proofErr w:type="gramStart"/>
+      <w:r>
+        <w:rPr>
+          <w:color w:val="45B0E1" w:themeColor="accent1" w:themeTint="99"/>
+        </w:rPr>
+        <w:t>cancelled out</w:t>
+      </w:r>
+      <w:proofErr w:type="gramEnd"/>
+      <w:r>
+        <w:rPr>
+          <w:color w:val="45B0E1" w:themeColor="accent1" w:themeTint="99"/>
+        </w:rPr>
+        <w:t xml:space="preserve"> or compounded. Thus, we feel it is important for practitioners to understand and recognize the potential failings of the method.</w:t>
+      </w:r>
+    </w:p>
     <w:p/>
     <w:p>
       <w:r>
@@ -144,93 +243,247 @@
         <w:t xml:space="preserve"> on bias. However, I would argue that MSE is at least as important as bias. An unbiased but very noisy estimator is arguably not as good as precise but slightly biased estimator.  </w:t>
       </w:r>
     </w:p>
+    <w:p>
+      <w:pPr>
+        <w:rPr>
+          <w:color w:val="45B0E1" w:themeColor="accent1" w:themeTint="99"/>
+        </w:rPr>
+      </w:pPr>
+      <w:r>
+        <w:rPr>
+          <w:color w:val="45B0E1" w:themeColor="accent1" w:themeTint="99"/>
+        </w:rPr>
+        <w:t xml:space="preserve">Thank you. </w:t>
+      </w:r>
+      <w:r>
+        <w:rPr>
+          <w:color w:val="45B0E1" w:themeColor="accent1" w:themeTint="99"/>
+        </w:rPr>
+        <w:t xml:space="preserve">We have added </w:t>
+      </w:r>
+      <w:r>
+        <w:rPr>
+          <w:color w:val="45B0E1" w:themeColor="accent1" w:themeTint="99"/>
+        </w:rPr>
+        <w:t xml:space="preserve">empirical </w:t>
+      </w:r>
+      <w:r>
+        <w:rPr>
+          <w:color w:val="45B0E1" w:themeColor="accent1" w:themeTint="99"/>
+        </w:rPr>
+        <w:t>MSE</w:t>
+      </w:r>
+      <w:r>
+        <w:rPr>
+          <w:color w:val="45B0E1" w:themeColor="accent1" w:themeTint="99"/>
+        </w:rPr>
+        <w:t xml:space="preserve"> values</w:t>
+      </w:r>
+      <w:r>
+        <w:rPr>
+          <w:color w:val="45B0E1" w:themeColor="accent1" w:themeTint="99"/>
+        </w:rPr>
+        <w:t>.</w:t>
+      </w:r>
+    </w:p>
     <w:p/>
     <w:p>
       <w:r>
+        <w:t>Second, all the mathematical notations should be clearly defined and used coherently. For example, \bar{x} is not defined (PDF p.12/45, around l.12). I don’t know if this is the same as \bar{X} (around l.56 of the same page), which is also not adequately defined.</w:t>
+      </w:r>
+    </w:p>
+    <w:p>
+      <w:pPr>
+        <w:rPr>
+          <w:color w:val="45B0E1" w:themeColor="accent1" w:themeTint="99"/>
+        </w:rPr>
+      </w:pPr>
+      <w:r>
+        <w:rPr>
+          <w:color w:val="45B0E1" w:themeColor="accent1" w:themeTint="99"/>
+        </w:rPr>
+        <w:t xml:space="preserve">Thank you, we </w:t>
+      </w:r>
+      <w:r>
+        <w:rPr>
+          <w:color w:val="45B0E1" w:themeColor="accent1" w:themeTint="99"/>
+        </w:rPr>
+        <w:t xml:space="preserve">have fixed </w:t>
+      </w:r>
+      <w:proofErr w:type="gramStart"/>
+      <w:r>
+        <w:rPr>
+          <w:color w:val="45B0E1" w:themeColor="accent1" w:themeTint="99"/>
+        </w:rPr>
+        <w:t>these</w:t>
+      </w:r>
+      <w:r>
+        <w:rPr>
+          <w:color w:val="45B0E1" w:themeColor="accent1" w:themeTint="99"/>
+        </w:rPr>
+        <w:t xml:space="preserve"> </w:t>
+      </w:r>
+      <w:proofErr w:type="spellStart"/>
+      <w:r>
+        <w:rPr>
+          <w:color w:val="45B0E1" w:themeColor="accent1" w:themeTint="99"/>
+        </w:rPr>
+        <w:t>these</w:t>
+      </w:r>
+      <w:proofErr w:type="spellEnd"/>
+      <w:proofErr w:type="gramEnd"/>
+      <w:r>
+        <w:rPr>
+          <w:color w:val="45B0E1" w:themeColor="accent1" w:themeTint="99"/>
+        </w:rPr>
+        <w:t>.</w:t>
+      </w:r>
+    </w:p>
+    <w:p/>
+    <w:p>
+      <w:r>
+        <w:t xml:space="preserve">Also, the interpretation of </w:t>
+      </w:r>
+      <w:proofErr w:type="gramStart"/>
+      <w:r>
+        <w:t>eq.(</w:t>
+      </w:r>
+      <w:proofErr w:type="gramEnd"/>
+      <w:r>
+        <w:t>5) does not seem correct. How could the population parameter be determined by parameter estimates? Also, \bar{X}_{target} looks like the sample mean but this ought to be the population mean if the LHS is supposed to be the population parameter.</w:t>
+      </w:r>
+    </w:p>
+    <w:p/>
+    <w:p>
+      <w:r>
+        <w:t xml:space="preserve">Third, the sampling is quite problematic to me. If I understand correctly, both the source and target are 20 percent simple random </w:t>
+      </w:r>
+      <w:proofErr w:type="gramStart"/>
+      <w:r>
+        <w:t>sample</w:t>
+      </w:r>
+      <w:proofErr w:type="gramEnd"/>
+      <w:r>
+        <w:t xml:space="preserve"> of the data. This means that 20 percent of the source survey appears in the target survey and vice versa. This is highly unrealistic. In a practical setting, there is no overlap.</w:t>
+      </w:r>
+    </w:p>
+    <w:p>
+      <w:pPr>
+        <w:rPr>
+          <w:color w:val="45B0E1" w:themeColor="accent1" w:themeTint="99"/>
+        </w:rPr>
+      </w:pPr>
+      <w:r>
+        <w:rPr>
+          <w:color w:val="45B0E1" w:themeColor="accent1" w:themeTint="99"/>
+        </w:rPr>
+        <w:t xml:space="preserve">Thank you. We agree. We have added simulations with real world data that better illustrate the problems. </w:t>
+      </w:r>
+    </w:p>
+    <w:p/>
+    <w:p>
+      <w:r>
+        <w:t>Finally, a very minor point.  + is repeated in Eq (10) before \</w:t>
+      </w:r>
+      <w:proofErr w:type="spellStart"/>
+      <w:r>
+        <w:t>eta_a</w:t>
+      </w:r>
+      <w:proofErr w:type="spellEnd"/>
+      <w:r>
+        <w:t>.</w:t>
+      </w:r>
+    </w:p>
+    <w:p/>
+    <w:p>
+      <w:r>
+        <w:t>Suggestions</w:t>
+      </w:r>
+    </w:p>
+    <w:p>
+      <w:r>
         <w:lastRenderedPageBreak/>
-        <w:t>Second, all the mathematical notations should be clearly defined and used coherently. For example, \bar{x} is not defined (PDF p.12/45, around l.12). I don’t know if this is the same as \bar{X} (around l.56 of the same page), which is also not adequately defined.</w:t>
+        <w:t xml:space="preserve">I suggest that the authors choose a realistic DGP in a particular country that ideally has at least two rounds of survey. Pick a parsimonious consumption model with five or so covariates (as with the current model). Ideally, these covariates are often chosen in consumption models elsewhere and mix </w:t>
+      </w:r>
+      <w:proofErr w:type="gramStart"/>
+      <w:r>
+        <w:t>discrete</w:t>
+      </w:r>
+      <w:proofErr w:type="gramEnd"/>
+      <w:r>
+        <w:t xml:space="preserve"> and continuous variables. Then, calibrate the DGP to mimic the empirical distribution of both covariates and outcomes. By doing this for two rounds, it would be possible to shed some light on some of the recommendations in the conclusion. Population and sample sizes should be calibrated at realistic levels (in the current setup, the sample size is ok, but the population size is way too small). In this way, the authors can still fully control data generation, but the results have at least some </w:t>
+      </w:r>
+      <w:proofErr w:type="gramStart"/>
+      <w:r>
+        <w:t>resemblance</w:t>
+      </w:r>
+      <w:proofErr w:type="gramEnd"/>
+      <w:r>
+        <w:t xml:space="preserve"> to the country that they chose.</w:t>
+      </w:r>
+    </w:p>
+    <w:p>
+      <w:pPr>
+        <w:rPr>
+          <w:color w:val="45B0E1" w:themeColor="accent1" w:themeTint="99"/>
+        </w:rPr>
+      </w:pPr>
+      <w:r>
+        <w:rPr>
+          <w:color w:val="45B0E1" w:themeColor="accent1" w:themeTint="99"/>
+        </w:rPr>
+        <w:t>Thank you, we have now tweaked the recommendation. We added simulations with a different DGP, but more importantly added simulations with real world data</w:t>
+      </w:r>
+      <w:r>
+        <w:rPr>
+          <w:color w:val="45B0E1" w:themeColor="accent1" w:themeTint="99"/>
+        </w:rPr>
+        <w:t>. We’ve used Mexican data as presented in Corral et al (2021) and Corral, Henderson and Segovia (2025) to run our simulations.</w:t>
       </w:r>
     </w:p>
     <w:p/>
     <w:p>
       <w:r>
-        <w:t xml:space="preserve">Also, the interpretation of </w:t>
-      </w:r>
-      <w:proofErr w:type="gramStart"/>
-      <w:r>
-        <w:t>eq.(</w:t>
-      </w:r>
-      <w:proofErr w:type="gramEnd"/>
-      <w:r>
-        <w:t>5) does not seem correct. How could the population parameter be determined by parameter estimates? Also, \bar{X}_{target} looks like the sample mean but this ought to be the population mean if the LHS is supposed to be the population parameter.</w:t>
+        <w:t>In the current simulation, all the covariates are independent of each other. This would be a natural starting point, but I would encourage the authors to consider allowing for some correlations between covariates. If two variables are highly correlated, omission of one of the two may not be as serious as the omission of some other covariates.</w:t>
+      </w:r>
+    </w:p>
+    <w:p>
+      <w:pPr>
+        <w:rPr>
+          <w:color w:val="45B0E1" w:themeColor="accent1" w:themeTint="99"/>
+        </w:rPr>
+      </w:pPr>
+      <w:r>
+        <w:rPr>
+          <w:color w:val="45B0E1" w:themeColor="accent1" w:themeTint="99"/>
+        </w:rPr>
+        <w:t xml:space="preserve">Thanks, </w:t>
+      </w:r>
+      <w:proofErr w:type="gramStart"/>
+      <w:r>
+        <w:rPr>
+          <w:color w:val="45B0E1" w:themeColor="accent1" w:themeTint="99"/>
+        </w:rPr>
+        <w:t>in</w:t>
+      </w:r>
+      <w:proofErr w:type="gramEnd"/>
+      <w:r>
+        <w:rPr>
+          <w:color w:val="45B0E1" w:themeColor="accent1" w:themeTint="99"/>
+        </w:rPr>
+        <w:t xml:space="preserve"> the current simulations we have 2 covariates that are correlated. In the Mexican data, correlations are also present.</w:t>
       </w:r>
     </w:p>
     <w:p/>
     <w:p>
       <w:r>
-        <w:t xml:space="preserve">Third, the sampling is quite problematic to me. If I understand correctly, both the source and target are 20 percent simple random </w:t>
-      </w:r>
-      <w:proofErr w:type="gramStart"/>
-      <w:r>
-        <w:t>sample</w:t>
-      </w:r>
-      <w:proofErr w:type="gramEnd"/>
-      <w:r>
-        <w:t xml:space="preserve"> of the data. This means that 20 percent of the source survey appears in the target survey and vice versa. This is highly unrealistic. In a practical setting, there is no overlap.</w:t>
-      </w:r>
-    </w:p>
-    <w:p/>
-    <w:p>
-      <w:r>
-        <w:t>Finally, a very minor point.  + is repeated in Eq (10) before \</w:t>
-      </w:r>
-      <w:proofErr w:type="spellStart"/>
-      <w:r>
-        <w:t>eta_a</w:t>
-      </w:r>
-      <w:proofErr w:type="spellEnd"/>
-      <w:r>
-        <w:t>.</w:t>
-      </w:r>
-    </w:p>
-    <w:p/>
-    <w:p>
-      <w:r>
-        <w:t>Suggestions</w:t>
-      </w:r>
-    </w:p>
-    <w:p>
-      <w:r>
-        <w:t xml:space="preserve">I suggest that the authors choose a realistic DGP in a particular country that ideally has at least two rounds of survey. Pick a parsimonious consumption model with five or so covariates (as with the current model). Ideally, these covariates are often chosen in consumption models elsewhere and mix </w:t>
-      </w:r>
-      <w:proofErr w:type="gramStart"/>
-      <w:r>
-        <w:t>discrete</w:t>
-      </w:r>
-      <w:proofErr w:type="gramEnd"/>
-      <w:r>
-        <w:t xml:space="preserve"> and continuous variables. Then, calibrate the DGP to mimic the empirical distribution of both covariates and outcomes. By doing this for two rounds, it would be possible to shed some light on some of the recommendations in the conclusion. Population and sample sizes should be calibrated at realistic levels (in the current setup, the sample size is ok, but the population size is way too small). In this way, the authors can still fully control data generation, but the results have at least some </w:t>
-      </w:r>
-      <w:proofErr w:type="gramStart"/>
-      <w:r>
-        <w:t>resemblance</w:t>
-      </w:r>
-      <w:proofErr w:type="gramEnd"/>
-      <w:r>
-        <w:t xml:space="preserve"> to the country that they chose.</w:t>
-      </w:r>
-    </w:p>
-    <w:p/>
-    <w:p>
-      <w:r>
-        <w:t>In the current simulation, all the covariates are independent of each other. This would be a natural starting point, but I would encourage the authors to consider allowing for some correlations between covariates. If two variables are highly correlated, omission of one of the two may not be as serious as the omission of some other covariates.</w:t>
-      </w:r>
-    </w:p>
-    <w:p/>
-    <w:p>
-      <w:r>
-        <w:t>Finally, to highlight the contribution of the paper, the recommendations in Section 5 should clarify which points were not known previously and how the authors’ simulations bring about such recommendations.</w:t>
-      </w:r>
+        <w:t xml:space="preserve">Finally, to highlight the contribution of the paper, the recommendations in </w:t>
+      </w:r>
+      <w:bookmarkStart w:id="0" w:name="_Hlk217376629"/>
+      <w:r>
+        <w:t>Section 5 should clarify which points were not known previously and how the authors’ simulations bring about such recommendations.</w:t>
+      </w:r>
+      <w:bookmarkEnd w:id="0"/>
     </w:p>
     <w:p/>
     <w:p>
@@ -329,7 +582,297 @@
         <w:rPr>
           <w:color w:val="45B0E1" w:themeColor="accent1" w:themeTint="99"/>
         </w:rPr>
-        <w:t xml:space="preserve">The example in Section 4.5.3 does not rely on eggs being an inferior good, nor does the simulation assert or require that household incomes causally reduce egg consumption. In the data-generating process, egg purchases and total expenditure remain positively correlated, consistent with a normal good. The key mechanism instead operates through the correlation between the omitted shock (e.g., conflict) and the probability of purchasing eggs. Conflict is negatively correlated with the decision to buy eggs, but the </w:t>
+        <w:t>We are not recommending eggs to be a proxy for the omitted shock</w:t>
+      </w:r>
+      <w:r>
+        <w:rPr>
+          <w:color w:val="45B0E1" w:themeColor="accent1" w:themeTint="99"/>
+        </w:rPr>
+        <w:t>, this would be an incorrect recommendation</w:t>
+      </w:r>
+      <w:r>
+        <w:rPr>
+          <w:color w:val="45B0E1" w:themeColor="accent1" w:themeTint="99"/>
+        </w:rPr>
+        <w:t xml:space="preserve">. </w:t>
+      </w:r>
+      <w:r>
+        <w:rPr>
+          <w:color w:val="45B0E1" w:themeColor="accent1" w:themeTint="99"/>
+        </w:rPr>
+        <w:t xml:space="preserve">We are indicating how eggs </w:t>
+      </w:r>
+      <w:proofErr w:type="gramStart"/>
+      <w:r>
+        <w:rPr>
+          <w:color w:val="45B0E1" w:themeColor="accent1" w:themeTint="99"/>
+        </w:rPr>
+        <w:t>is</w:t>
+      </w:r>
+      <w:proofErr w:type="gramEnd"/>
+      <w:r>
+        <w:rPr>
+          <w:color w:val="45B0E1" w:themeColor="accent1" w:themeTint="99"/>
+        </w:rPr>
+        <w:t xml:space="preserve"> affected by the omission of conflict. This is </w:t>
+      </w:r>
+      <w:proofErr w:type="gramStart"/>
+      <w:r>
+        <w:rPr>
+          <w:color w:val="45B0E1" w:themeColor="accent1" w:themeTint="99"/>
+        </w:rPr>
+        <w:t>similar to</w:t>
+      </w:r>
+      <w:proofErr w:type="gramEnd"/>
+      <w:r>
+        <w:rPr>
+          <w:color w:val="45B0E1" w:themeColor="accent1" w:themeTint="99"/>
+        </w:rPr>
+        <w:t xml:space="preserve"> Wooldridge’s (2010 </w:t>
+      </w:r>
+      <w:proofErr w:type="spellStart"/>
+      <w:r>
+        <w:rPr>
+          <w:color w:val="45B0E1" w:themeColor="accent1" w:themeTint="99"/>
+        </w:rPr>
+        <w:t>p</w:t>
+      </w:r>
+      <w:r>
+        <w:rPr>
+          <w:color w:val="FF0000"/>
+        </w:rPr>
+        <w:t>XX</w:t>
+      </w:r>
+      <w:proofErr w:type="spellEnd"/>
+      <w:r>
+        <w:rPr>
+          <w:color w:val="45B0E1" w:themeColor="accent1" w:themeTint="99"/>
+        </w:rPr>
+        <w:t xml:space="preserve">) example on how omitting ability from the regression impacts the coefficient for education. In our example, eggs </w:t>
+      </w:r>
+      <w:proofErr w:type="gramStart"/>
+      <w:r>
+        <w:rPr>
+          <w:color w:val="45B0E1" w:themeColor="accent1" w:themeTint="99"/>
+        </w:rPr>
+        <w:t>is</w:t>
+      </w:r>
+      <w:proofErr w:type="gramEnd"/>
+      <w:r>
+        <w:rPr>
+          <w:color w:val="45B0E1" w:themeColor="accent1" w:themeTint="99"/>
+        </w:rPr>
+        <w:t xml:space="preserve"> in place of education and conflict is akin to ability.</w:t>
+      </w:r>
+      <w:r>
+        <w:rPr>
+          <w:color w:val="45B0E1" w:themeColor="accent1" w:themeTint="99"/>
+        </w:rPr>
+        <w:t xml:space="preserve"> A valid proxy for conflict would be </w:t>
+      </w:r>
+      <w:proofErr w:type="gramStart"/>
+      <w:r>
+        <w:rPr>
+          <w:color w:val="45B0E1" w:themeColor="accent1" w:themeTint="99"/>
+        </w:rPr>
+        <w:t>battle</w:t>
+      </w:r>
+      <w:proofErr w:type="gramEnd"/>
+      <w:r>
+        <w:rPr>
+          <w:color w:val="45B0E1" w:themeColor="accent1" w:themeTint="99"/>
+        </w:rPr>
+        <w:t xml:space="preserve"> deaths </w:t>
+      </w:r>
+      <w:proofErr w:type="gramStart"/>
+      <w:r>
+        <w:rPr>
+          <w:color w:val="45B0E1" w:themeColor="accent1" w:themeTint="99"/>
+        </w:rPr>
+        <w:t>in a given</w:t>
+      </w:r>
+      <w:proofErr w:type="gramEnd"/>
+      <w:r>
+        <w:rPr>
+          <w:color w:val="45B0E1" w:themeColor="accent1" w:themeTint="99"/>
+        </w:rPr>
+        <w:t xml:space="preserve"> proximity to the household.</w:t>
+      </w:r>
+    </w:p>
+    <w:p>
+      <w:pPr>
+        <w:rPr>
+          <w:color w:val="45B0E1" w:themeColor="accent1" w:themeTint="99"/>
+        </w:rPr>
+      </w:pPr>
+      <w:r>
+        <w:rPr>
+          <w:color w:val="45B0E1" w:themeColor="accent1" w:themeTint="99"/>
+        </w:rPr>
+        <w:t xml:space="preserve">We would </w:t>
+      </w:r>
+      <w:r>
+        <w:rPr>
+          <w:color w:val="45B0E1" w:themeColor="accent1" w:themeTint="99"/>
+        </w:rPr>
+        <w:t>not recommend</w:t>
+      </w:r>
+      <w:r>
+        <w:rPr>
+          <w:color w:val="45B0E1" w:themeColor="accent1" w:themeTint="99"/>
+        </w:rPr>
+        <w:t xml:space="preserve"> </w:t>
+      </w:r>
+      <w:proofErr w:type="gramStart"/>
+      <w:r>
+        <w:rPr>
+          <w:color w:val="45B0E1" w:themeColor="accent1" w:themeTint="99"/>
+        </w:rPr>
+        <w:t>to use</w:t>
+      </w:r>
+      <w:proofErr w:type="gramEnd"/>
+      <w:r>
+        <w:rPr>
+          <w:color w:val="45B0E1" w:themeColor="accent1" w:themeTint="99"/>
+        </w:rPr>
+        <w:t xml:space="preserve"> a food consumption dummy as a proxy variable as it </w:t>
+      </w:r>
+      <w:r>
+        <w:rPr>
+          <w:color w:val="45B0E1" w:themeColor="accent1" w:themeTint="99"/>
+        </w:rPr>
+        <w:t>violate</w:t>
+      </w:r>
+      <w:r>
+        <w:rPr>
+          <w:color w:val="45B0E1" w:themeColor="accent1" w:themeTint="99"/>
+        </w:rPr>
+        <w:t>s</w:t>
+      </w:r>
+      <w:r>
+        <w:rPr>
+          <w:color w:val="45B0E1" w:themeColor="accent1" w:themeTint="99"/>
+        </w:rPr>
+        <w:t xml:space="preserve"> the conditions required for a </w:t>
+      </w:r>
+      <w:proofErr w:type="gramStart"/>
+      <w:r>
+        <w:rPr>
+          <w:color w:val="45B0E1" w:themeColor="accent1" w:themeTint="99"/>
+        </w:rPr>
+        <w:t>proxy variable</w:t>
+      </w:r>
+      <w:proofErr w:type="gramEnd"/>
+      <w:r>
+        <w:rPr>
+          <w:color w:val="45B0E1" w:themeColor="accent1" w:themeTint="99"/>
+        </w:rPr>
+        <w:t xml:space="preserve"> to be valid. </w:t>
+      </w:r>
+      <w:r>
+        <w:rPr>
+          <w:color w:val="45B0E1" w:themeColor="accent1" w:themeTint="99"/>
+        </w:rPr>
+        <w:t>Total</w:t>
+      </w:r>
+      <w:r>
+        <w:rPr>
+          <w:color w:val="45B0E1" w:themeColor="accent1" w:themeTint="99"/>
+        </w:rPr>
+        <w:t xml:space="preserve"> household expenditure </w:t>
+      </w:r>
+      <w:r>
+        <w:rPr>
+          <w:color w:val="45B0E1" w:themeColor="accent1" w:themeTint="99"/>
+        </w:rPr>
+        <w:t xml:space="preserve">is a function of the goods purchased by the household, in which case the </w:t>
+      </w:r>
+      <w:r>
+        <w:rPr>
+          <w:color w:val="45B0E1" w:themeColor="accent1" w:themeTint="99"/>
+        </w:rPr>
+        <w:t xml:space="preserve">precondition of the proxy being only relevant to the model </w:t>
+      </w:r>
+      <w:r>
+        <w:rPr>
+          <w:b/>
+          <w:bCs/>
+          <w:color w:val="45B0E1" w:themeColor="accent1" w:themeTint="99"/>
+        </w:rPr>
+        <w:t>only</w:t>
+      </w:r>
+      <w:r>
+        <w:rPr>
+          <w:color w:val="45B0E1" w:themeColor="accent1" w:themeTint="99"/>
+        </w:rPr>
+        <w:t xml:space="preserve"> through its relationship to the omitted variable will not hold</w:t>
+      </w:r>
+      <w:r>
+        <w:rPr>
+          <w:color w:val="45B0E1" w:themeColor="accent1" w:themeTint="99"/>
+        </w:rPr>
+        <w:t xml:space="preserve"> (see Wooldridge 2010)</w:t>
+      </w:r>
+      <w:r>
+        <w:rPr>
+          <w:color w:val="45B0E1" w:themeColor="accent1" w:themeTint="99"/>
+        </w:rPr>
+        <w:t xml:space="preserve">. </w:t>
+      </w:r>
+      <w:r>
+        <w:rPr>
+          <w:color w:val="45B0E1" w:themeColor="accent1" w:themeTint="99"/>
+        </w:rPr>
+        <w:t>W</w:t>
+      </w:r>
+      <w:r>
+        <w:rPr>
+          <w:color w:val="45B0E1" w:themeColor="accent1" w:themeTint="99"/>
+        </w:rPr>
+        <w:t>e will clarify this in the text.</w:t>
+      </w:r>
+    </w:p>
+    <w:p>
+      <w:pPr>
+        <w:rPr>
+          <w:color w:val="45B0E1" w:themeColor="accent1" w:themeTint="99"/>
+        </w:rPr>
+      </w:pPr>
+      <w:r>
+        <w:rPr>
+          <w:color w:val="45B0E1" w:themeColor="accent1" w:themeTint="99"/>
+        </w:rPr>
+        <w:t>Moreover, we are puzzled by the reviewer</w:t>
+      </w:r>
+      <w:r>
+        <w:rPr>
+          <w:color w:val="45B0E1" w:themeColor="accent1" w:themeTint="99"/>
+        </w:rPr>
+        <w:t>’s take on eggs being an inferior good. For starters, the relationship between egg purchases and expenditure in the model, as captured by the coefficient of 0.4, is clearly positive.</w:t>
+      </w:r>
+      <w:r>
+        <w:rPr>
+          <w:color w:val="45B0E1" w:themeColor="accent1" w:themeTint="99"/>
+        </w:rPr>
+        <w:t xml:space="preserve"> Thus, i</w:t>
+      </w:r>
+      <w:r>
+        <w:rPr>
+          <w:color w:val="45B0E1" w:themeColor="accent1" w:themeTint="99"/>
+        </w:rPr>
+        <w:t>n the data-generating process, egg purchases and total expenditure remain positively correlated, consistent with a normal good. The key mechanism instead operates through the correlation between the omitted shock (e.g., conflict) and the probability of purchasing eggs. Conflict is negatively correlated with the decision to buy eggs</w:t>
+      </w:r>
+      <w:r>
+        <w:rPr>
+          <w:color w:val="45B0E1" w:themeColor="accent1" w:themeTint="99"/>
+        </w:rPr>
+        <w:t>, as can be expected</w:t>
+      </w:r>
+      <w:r>
+        <w:rPr>
+          <w:color w:val="45B0E1" w:themeColor="accent1" w:themeTint="99"/>
+        </w:rPr>
+        <w:t xml:space="preserve">, but the </w:t>
       </w:r>
       <w:r>
         <w:rPr>
@@ -341,7 +884,33 @@
         <w:rPr>
           <w:color w:val="45B0E1" w:themeColor="accent1" w:themeTint="99"/>
         </w:rPr>
-        <w:t>itself is also influenced by multiple external factors captured in x. When these factors change over time—even as average welfare rises—the share of households purchasing eggs may move in either direction independently of welfare trends. This is consistent with well-documented empirical patterns: supply-side disruptions (avian influenza outbreaks, changes in feed prices), market access constraints, local mobility restrictions, or short-term availability shocks can all reduce observed consumption of specific items despite rising incomes.</w:t>
+        <w:t xml:space="preserve">itself is also influenced by multiple external factors captured in x. When these factors change over time—even as average welfare rises—the share of households purchasing eggs may move in either direction independently of welfare trends. This is consistent with </w:t>
+      </w:r>
+      <w:r>
+        <w:rPr>
+          <w:color w:val="45B0E1" w:themeColor="accent1" w:themeTint="99"/>
+        </w:rPr>
+        <w:t xml:space="preserve">broader </w:t>
+      </w:r>
+      <w:proofErr w:type="spellStart"/>
+      <w:r>
+        <w:rPr>
+          <w:color w:val="45B0E1" w:themeColor="accent1" w:themeTint="99"/>
+        </w:rPr>
+        <w:t>phenomen</w:t>
+      </w:r>
+      <w:proofErr w:type="spellEnd"/>
+      <w:r>
+        <w:rPr>
+          <w:color w:val="45B0E1" w:themeColor="accent1" w:themeTint="99"/>
+        </w:rPr>
+        <w:t xml:space="preserve"> like </w:t>
+      </w:r>
+      <w:r>
+        <w:rPr>
+          <w:color w:val="45B0E1" w:themeColor="accent1" w:themeTint="99"/>
+        </w:rPr>
+        <w:t>supply-side disruptions (avian influenza outbreaks, changes in feed prices), market access constraints, local mobility restrictions, or short-term availability shocks can all reduce observed consumption of specific items despite rising incomes.</w:t>
       </w:r>
     </w:p>
     <w:p>
@@ -391,7 +960,11 @@
       </w:r>
       <w:proofErr w:type="spellEnd"/>
       <w:r>
-        <w:t xml:space="preserve"> et al. (2013), and Yoshida et al. (2022)—shows that S2S models can closely replicate direct survey-based poverty estimates. More recently, Dang et al. (2025) demonstrate that, even under a randomized experimental design, an S2S model trained on pre-pandemic data accurately predicted post-pandemic poverty rates. These studies suggest that violations of core assumptions may not occur frequently, implying that concerns about model instability could be less critical in most practical applications.</w:t>
+        <w:t xml:space="preserve"> et al. (2013), and Yoshida et al. (2022)—shows that S2S models can closely replicate direct survey-based poverty estimates. More recently, Dang et al. (2025) demonstrate that, even under a randomized experimental design, an S2S model trained on pre-pandemic data </w:t>
+      </w:r>
+      <w:r>
+        <w:lastRenderedPageBreak/>
+        <w:t>accurately predicted post-pandemic poverty rates. These studies suggest that violations of core assumptions may not occur frequently, implying that concerns about model instability could be less critical in most practical applications.</w:t>
       </w:r>
     </w:p>
     <w:p>
@@ -410,33 +983,192 @@
     <w:p/>
     <w:p>
       <w:r>
-        <w:t xml:space="preserve">Nevertheless, the likelihood of such problematic cases remains an open empirical question. Because the analysis in this paper relies on specific data-generating processes (DGPs), it is difficult to assess how often these risks materialize in real data. To enhance robustness and external validity, future research could complement the simulation analysis with empirical assessments using household survey data from multiple countries. Such evidence would help determine whether the </w:t>
+        <w:t>Nevertheless, the likelihood of such problematic cases remains an open empirical question. Because the analysis in this paper relies on specific data-generating processes (DGPs), it is difficult to assess how often these risks materialize in real data. To enhance robustness and external validity, future research could complement the simulation analysis with empirical assessments using household survey data from multiple countries. Such evidence would help determine whether the patterns observed in the simulations persist in real-world settings where the true DGP and model structure are unknown.</w:t>
+      </w:r>
+    </w:p>
+    <w:p/>
+    <w:p>
+      <w:r>
+        <w:t xml:space="preserve">2. This paper suggests that S2S fails if the model stability is violated, but is this true? Even if one parameter changes over time, the changes in other parameters can offset it, and as a result, a model trained in one round of survey can predict poverty rates accurately in later rounds. An empirical assessment </w:t>
+      </w:r>
+      <w:proofErr w:type="gramStart"/>
+      <w:r>
+        <w:t>on</w:t>
+      </w:r>
+      <w:proofErr w:type="gramEnd"/>
+      <w:r>
+        <w:t xml:space="preserve"> this is shown in Yoshida et al. 2022 (Table 5). Even though the percentage of stable coefficients is less than 70 percent, the model can predict poverty rates well in the testing data. This does not reduce the value of the analysis in this paper, but it will be useful to add caveats when it discusses the relationship between the </w:t>
+      </w:r>
+      <w:proofErr w:type="gramStart"/>
+      <w:r>
+        <w:t>model stability</w:t>
+      </w:r>
+      <w:proofErr w:type="gramEnd"/>
+      <w:r>
+        <w:t xml:space="preserve"> and the accuracy of the S2S.</w:t>
+      </w:r>
+    </w:p>
+    <w:p>
+      <w:pPr>
+        <w:rPr>
+          <w:color w:val="45B0E1" w:themeColor="accent1" w:themeTint="99"/>
+        </w:rPr>
+      </w:pPr>
+      <w:r>
+        <w:rPr>
+          <w:color w:val="45B0E1" w:themeColor="accent1" w:themeTint="99"/>
+        </w:rPr>
+        <w:t xml:space="preserve">Thanks! </w:t>
+      </w:r>
+      <w:r>
+        <w:rPr>
+          <w:color w:val="45B0E1" w:themeColor="accent1" w:themeTint="99"/>
+        </w:rPr>
+        <w:t xml:space="preserve">These studies fail to indicate how many models </w:t>
+      </w:r>
+      <w:proofErr w:type="gramStart"/>
+      <w:r>
+        <w:rPr>
+          <w:color w:val="45B0E1" w:themeColor="accent1" w:themeTint="99"/>
+        </w:rPr>
+        <w:t>were fit</w:t>
+      </w:r>
+      <w:proofErr w:type="gramEnd"/>
+      <w:r>
+        <w:rPr>
+          <w:color w:val="45B0E1" w:themeColor="accent1" w:themeTint="99"/>
+        </w:rPr>
+        <w:t xml:space="preserve"> until the right one was obtained. In upcoming </w:t>
+      </w:r>
+      <w:proofErr w:type="gramStart"/>
+      <w:r>
+        <w:rPr>
+          <w:color w:val="45B0E1" w:themeColor="accent1" w:themeTint="99"/>
+        </w:rPr>
+        <w:t>work</w:t>
+      </w:r>
+      <w:proofErr w:type="gramEnd"/>
+      <w:r>
+        <w:rPr>
+          <w:color w:val="45B0E1" w:themeColor="accent1" w:themeTint="99"/>
+        </w:rPr>
+        <w:t xml:space="preserve"> we highlight how these methods fail to predict changes in poverty in </w:t>
+      </w:r>
+      <w:proofErr w:type="gramStart"/>
+      <w:r>
+        <w:rPr>
+          <w:color w:val="45B0E1" w:themeColor="accent1" w:themeTint="99"/>
+        </w:rPr>
+        <w:t>the Peru</w:t>
+      </w:r>
+      <w:proofErr w:type="gramEnd"/>
+      <w:r>
+        <w:rPr>
+          <w:color w:val="45B0E1" w:themeColor="accent1" w:themeTint="99"/>
+        </w:rPr>
+        <w:t xml:space="preserve">. The simulations presented here are useful to illustrate how easy it is for these methods to fail. </w:t>
+      </w:r>
+    </w:p>
+    <w:p/>
+    <w:p>
+      <w:r>
+        <w:t>3. In this paper, comparisons of alternative methodologies in the paper rely primarily on point estimates of bias. For instance, Figure 5 reports the bias in the FGT₀ index under a two-fold DGP, but each value shown represents only a single point estimate. Even if these point estimates appear biased, the deviations may not be statistically significant once their sampling variability is considered. This concern is particularly relevant because the reported biases are extremely small in nearly all analyses. For example, Figure 5 indicates that all approaches exhibit biases below 0.06 percentage points. Given such small magnitudes, it is plausible that none of these biases would be statistically distinguishable from zero if standard errors were computed. Hence, while point estimates are informative descriptively, they may overstate the apparent differences in performance across methods unless statistical uncertainty is explicitly reported.</w:t>
+      </w:r>
+    </w:p>
+    <w:p>
+      <w:pPr>
+        <w:rPr>
+          <w:color w:val="45B0E1" w:themeColor="accent1" w:themeTint="99"/>
+        </w:rPr>
+      </w:pPr>
+      <w:r>
+        <w:rPr>
+          <w:color w:val="45B0E1" w:themeColor="accent1" w:themeTint="99"/>
+        </w:rPr>
+        <w:t xml:space="preserve">Thanks! We’ll clarify in the text. The purpose of the figure is to illustrate that the clustered nature of the DGP has little impact on the bias of the estimates when ignoring the nested nature of the DGP. </w:t>
+      </w:r>
+    </w:p>
+    <w:p/>
+    <w:p>
+      <w:r>
+        <w:t xml:space="preserve">4. Section 4.3 would benefit from additional clarification to make the argument clearer. First, the definitions and interpretations of empirical MSE and average estimated MSE should be stated </w:t>
       </w:r>
       <w:r>
         <w:lastRenderedPageBreak/>
-        <w:t>patterns observed in the simulations persist in real-world settings where the true DGP and model structure are unknown.</w:t>
+        <w:t>explicitly. It would also help to specify that “BLUP” refers to the variance estimated using the parametric bootstrap approach, following the small-area estimation literature.</w:t>
+      </w:r>
+    </w:p>
+    <w:p>
+      <w:pPr>
+        <w:rPr>
+          <w:color w:val="45B0E1" w:themeColor="accent1" w:themeTint="99"/>
+        </w:rPr>
+      </w:pPr>
+      <w:r>
+        <w:rPr>
+          <w:color w:val="45B0E1" w:themeColor="accent1" w:themeTint="99"/>
+        </w:rPr>
+        <w:t xml:space="preserve">The MSE is estimated </w:t>
+      </w:r>
+      <w:proofErr w:type="gramStart"/>
+      <w:r>
+        <w:rPr>
+          <w:color w:val="45B0E1" w:themeColor="accent1" w:themeTint="99"/>
+        </w:rPr>
+        <w:t>following</w:t>
+      </w:r>
+      <w:proofErr w:type="gramEnd"/>
+      <w:r>
+        <w:rPr>
+          <w:color w:val="45B0E1" w:themeColor="accent1" w:themeTint="99"/>
+        </w:rPr>
+        <w:t xml:space="preserve"> standard statistical </w:t>
+      </w:r>
+      <w:proofErr w:type="gramStart"/>
+      <w:r>
+        <w:rPr>
+          <w:color w:val="45B0E1" w:themeColor="accent1" w:themeTint="99"/>
+        </w:rPr>
+        <w:t>literature</w:t>
+      </w:r>
+      <w:r>
+        <w:rPr>
+          <w:color w:val="45B0E1" w:themeColor="accent1" w:themeTint="99"/>
+        </w:rPr>
+        <w:t>, and</w:t>
+      </w:r>
+      <w:proofErr w:type="gramEnd"/>
+      <w:r>
+        <w:rPr>
+          <w:color w:val="45B0E1" w:themeColor="accent1" w:themeTint="99"/>
+        </w:rPr>
+        <w:t xml:space="preserve"> follows the assumed model</w:t>
+      </w:r>
+      <w:r>
+        <w:rPr>
+          <w:color w:val="45B0E1" w:themeColor="accent1" w:themeTint="99"/>
+        </w:rPr>
+        <w:t xml:space="preserve">. The parametric bootstrap yields an estimate of the MSE. What figure 8 illustrates is </w:t>
+      </w:r>
+      <w:proofErr w:type="gramStart"/>
+      <w:r>
+        <w:rPr>
+          <w:color w:val="45B0E1" w:themeColor="accent1" w:themeTint="99"/>
+        </w:rPr>
+        <w:t>that in reality, the</w:t>
+      </w:r>
+      <w:proofErr w:type="gramEnd"/>
+      <w:r>
+        <w:rPr>
+          <w:color w:val="45B0E1" w:themeColor="accent1" w:themeTint="99"/>
+        </w:rPr>
+        <w:t xml:space="preserve"> typical noise measure used in MI as well as the noise estimated via a parametric bootstrap yield an upward biased estimate of the noise, in this case noted by the empirical MSE.</w:t>
       </w:r>
     </w:p>
     <w:p/>
     <w:p>
       <w:r>
-        <w:t xml:space="preserve">2. This paper suggests that S2S fails if the model stability is violated, but is this true? Even if one parameter changes over time, the changes in other parameters can offset it, and as a result, a model trained in one round of survey can predict poverty rates accurately in later rounds. An empirical assessment </w:t>
-      </w:r>
-      <w:proofErr w:type="gramStart"/>
-      <w:r>
-        <w:t>on</w:t>
-      </w:r>
-      <w:proofErr w:type="gramEnd"/>
-      <w:r>
-        <w:t xml:space="preserve"> this is shown in Yoshida et al. 2022 (Table 5). Even though the percentage of stable coefficients is less than 70 percent, the model can predict poverty rates well in the testing data. This does not reduce the value of the analysis in this paper, but it will be useful to add caveats when it discusses the relationship between the </w:t>
-      </w:r>
-      <w:proofErr w:type="gramStart"/>
-      <w:r>
-        <w:t>model stability</w:t>
-      </w:r>
-      <w:proofErr w:type="gramEnd"/>
-      <w:r>
-        <w:t xml:space="preserve"> and the accuracy of the S2S.</w:t>
+        <w:t>The results suggest that MSEs obtained under the MI framework differ more from the true (empirical) MSE than those estimated by the parametric bootstrap. However, the last sentence of Section 4.3 states that “the variance estimated following Rubin’s rules will yield a downward-biased estimate of the true noise,” which seems inconsistent. A short explanation would clarify under which conditions Rubin’s rules underestimate or overestimate noise.</w:t>
       </w:r>
     </w:p>
     <w:p>
@@ -449,61 +1181,65 @@
         <w:rPr>
           <w:color w:val="45B0E1" w:themeColor="accent1" w:themeTint="99"/>
         </w:rPr>
-        <w:t xml:space="preserve">Thanks! </w:t>
-      </w:r>
-      <w:r>
-        <w:rPr>
-          <w:color w:val="45B0E1" w:themeColor="accent1" w:themeTint="99"/>
-        </w:rPr>
-        <w:t xml:space="preserve">These studies fail to indicate how many models </w:t>
-      </w:r>
-      <w:proofErr w:type="gramStart"/>
-      <w:r>
-        <w:rPr>
-          <w:color w:val="45B0E1" w:themeColor="accent1" w:themeTint="99"/>
-        </w:rPr>
-        <w:t>were fit</w:t>
-      </w:r>
-      <w:proofErr w:type="gramEnd"/>
-      <w:r>
-        <w:rPr>
-          <w:color w:val="45B0E1" w:themeColor="accent1" w:themeTint="99"/>
-        </w:rPr>
-        <w:t xml:space="preserve"> until the right one was obtained. In upcoming </w:t>
-      </w:r>
-      <w:proofErr w:type="gramStart"/>
-      <w:r>
-        <w:rPr>
-          <w:color w:val="45B0E1" w:themeColor="accent1" w:themeTint="99"/>
-        </w:rPr>
-        <w:t>work</w:t>
-      </w:r>
-      <w:proofErr w:type="gramEnd"/>
-      <w:r>
-        <w:rPr>
-          <w:color w:val="45B0E1" w:themeColor="accent1" w:themeTint="99"/>
-        </w:rPr>
-        <w:t xml:space="preserve"> we highlight how these methods fail to predict changes in poverty in </w:t>
-      </w:r>
-      <w:proofErr w:type="gramStart"/>
-      <w:r>
-        <w:rPr>
-          <w:color w:val="45B0E1" w:themeColor="accent1" w:themeTint="99"/>
-        </w:rPr>
-        <w:t>the Peru</w:t>
-      </w:r>
-      <w:proofErr w:type="gramEnd"/>
-      <w:r>
-        <w:rPr>
-          <w:color w:val="45B0E1" w:themeColor="accent1" w:themeTint="99"/>
-        </w:rPr>
-        <w:t xml:space="preserve">. The simulations presented here are useful to illustrate how easy it is for these methods to fail. </w:t>
+        <w:t>Thanks!</w:t>
+      </w:r>
+      <w:r>
+        <w:rPr>
+          <w:color w:val="45B0E1" w:themeColor="accent1" w:themeTint="99"/>
+        </w:rPr>
+        <w:t xml:space="preserve"> We will clarify in the text this issue. </w:t>
+      </w:r>
+      <w:r>
+        <w:rPr>
+          <w:color w:val="45B0E1" w:themeColor="accent1" w:themeTint="99"/>
+        </w:rPr>
+        <w:t xml:space="preserve">The MI approach, as noted in the literature adds noise to estimates on purpose. </w:t>
+      </w:r>
+    </w:p>
+    <w:p>
+      <w:pPr>
+        <w:rPr>
+          <w:color w:val="45B0E1" w:themeColor="accent1" w:themeTint="99"/>
+        </w:rPr>
+      </w:pPr>
+      <w:r>
+        <w:rPr>
+          <w:color w:val="45B0E1" w:themeColor="accent1" w:themeTint="99"/>
+        </w:rPr>
+        <w:t xml:space="preserve">What imputations following MI literature obtain is a variance measure not necessarily an MSE estimate, se Corral, Molina and Nguyen (2022) for a discussion. </w:t>
+      </w:r>
+    </w:p>
+    <w:p>
+      <w:pPr>
+        <w:rPr>
+          <w:color w:val="45B0E1" w:themeColor="accent1" w:themeTint="99"/>
+        </w:rPr>
+      </w:pPr>
+      <w:r>
+        <w:rPr>
+          <w:color w:val="45B0E1" w:themeColor="accent1" w:themeTint="99"/>
+        </w:rPr>
+        <w:t>The problem arises because the MSE is the sum of the variance and the squared bias. Thus, if the estimates are biased, the second term will be larger and will underestimate the MSE.</w:t>
       </w:r>
     </w:p>
     <w:p/>
     <w:p>
       <w:r>
-        <w:t>3. In this paper, comparisons of alternative methodologies in the paper rely primarily on point estimates of bias. For instance, Figure 5 reports the bias in the FGT₀ index under a two-fold DGP, but each value shown represents only a single point estimate. Even if these point estimates appear biased, the deviations may not be statistically significant once their sampling variability is considered. This concern is particularly relevant because the reported biases are extremely small in nearly all analyses. For example, Figure 5 indicates that all approaches exhibit biases below 0.06 percentage points. Given such small magnitudes, it is plausible that none of these biases would be statistically distinguishable from zero if standard errors were computed. Hence, while point estimates are informative descriptively, they may overstate the apparent differences in performance across methods unless statistical uncertainty is explicitly reported.</w:t>
+        <w:t>The paper rightly observes that the average estimated MSEs from both MI and BLUP are systematically larger than the empirical MSE because they are computed from smaller samples. In that case, the difference should not be interpreted as a bias—so MI or BLUP do not truly “overestimate” MSE. Instead, the result reflects a scale difference between population- and sample-based variances, which is not problematic.</w:t>
+      </w:r>
+    </w:p>
+    <w:p/>
+    <w:p>
+      <w:r>
+        <w:t xml:space="preserve">Finally, MI and parametric </w:t>
+      </w:r>
+      <w:proofErr w:type="gramStart"/>
+      <w:r>
+        <w:t>bootstrap</w:t>
+      </w:r>
+      <w:proofErr w:type="gramEnd"/>
+      <w:r>
+        <w:t xml:space="preserve"> inherently differ because MI incorporates the uncertainty of coefficient and variance estimates, whereas the parametric bootstrap treats them as fixed. The latter is appropriate when OLS estimates are consistent and the sample is large, as parameter uncertainty vanishes asymptotically. When sample sizes are limited, however, the parametric bootstrap may underestimate total MSE. Hence, MI-based MSEs are expected to be larger, but this does not imply superiority of one approach over the other. Including a short theoretical discussion on the asymptotic and small-sample properties of MI and the parametric bootstrap would help readers interpret the simulation results more effectively.</w:t>
       </w:r>
     </w:p>
     <w:p>
@@ -516,252 +1252,193 @@
         <w:rPr>
           <w:color w:val="45B0E1" w:themeColor="accent1" w:themeTint="99"/>
         </w:rPr>
-        <w:t xml:space="preserve">Thanks! We’ll clarify in the text. The purpose of the figure is to illustrate that the clustered nature of the DGP has little impact on the bias of the estimates when ignoring the nested nature of the DGP. </w:t>
+        <w:t xml:space="preserve">The sample size plays no role in the process. </w:t>
+      </w:r>
+    </w:p>
+    <w:p>
+      <w:pPr>
+        <w:rPr>
+          <w:color w:val="45B0E1" w:themeColor="accent1" w:themeTint="99"/>
+        </w:rPr>
+      </w:pPr>
+      <w:r>
+        <w:rPr>
+          <w:color w:val="45B0E1" w:themeColor="accent1" w:themeTint="99"/>
+        </w:rPr>
+        <w:t>Under the parametric bootstrap replicates the betas do vary</w:t>
+      </w:r>
+      <w:r>
+        <w:rPr>
+          <w:color w:val="45B0E1" w:themeColor="accent1" w:themeTint="99"/>
+        </w:rPr>
+        <w:t>, this is a common misunderstanding</w:t>
+      </w:r>
+      <w:r>
+        <w:rPr>
+          <w:color w:val="45B0E1" w:themeColor="accent1" w:themeTint="99"/>
+        </w:rPr>
+        <w:t xml:space="preserve">. The survey’s betas are taken as the truth and are used to create multiple census data, where across the census data the only thing that varies </w:t>
+      </w:r>
+      <w:proofErr w:type="gramStart"/>
+      <w:r>
+        <w:rPr>
+          <w:color w:val="45B0E1" w:themeColor="accent1" w:themeTint="99"/>
+        </w:rPr>
+        <w:t>are</w:t>
+      </w:r>
+      <w:proofErr w:type="gramEnd"/>
+      <w:r>
+        <w:rPr>
+          <w:color w:val="45B0E1" w:themeColor="accent1" w:themeTint="99"/>
+        </w:rPr>
+        <w:t xml:space="preserve"> the simulated errors, but these still come from the </w:t>
+      </w:r>
+      <w:proofErr w:type="spellStart"/>
+      <w:r>
+        <w:rPr>
+          <w:color w:val="45B0E1" w:themeColor="accent1" w:themeTint="99"/>
+        </w:rPr>
+        <w:t>sigmas</w:t>
+      </w:r>
+      <w:proofErr w:type="spellEnd"/>
+      <w:r>
+        <w:rPr>
+          <w:color w:val="45B0E1" w:themeColor="accent1" w:themeTint="99"/>
+        </w:rPr>
+        <w:t xml:space="preserve"> estimated in the survey. </w:t>
+      </w:r>
+      <w:proofErr w:type="gramStart"/>
+      <w:r>
+        <w:rPr>
+          <w:color w:val="45B0E1" w:themeColor="accent1" w:themeTint="99"/>
+        </w:rPr>
+        <w:t>Thus</w:t>
+      </w:r>
+      <w:proofErr w:type="gramEnd"/>
+      <w:r>
+        <w:rPr>
+          <w:color w:val="45B0E1" w:themeColor="accent1" w:themeTint="99"/>
+        </w:rPr>
+        <w:t xml:space="preserve"> across bootstrap replicates, the betas and distribution parameters vary.</w:t>
+      </w:r>
+    </w:p>
+    <w:p>
+      <w:r>
+        <w:rPr>
+          <w:color w:val="45B0E1" w:themeColor="accent1" w:themeTint="99"/>
+        </w:rPr>
+        <w:lastRenderedPageBreak/>
+        <w:t xml:space="preserve">Across each of these censuses, the survey sample is </w:t>
+      </w:r>
+      <w:proofErr w:type="gramStart"/>
+      <w:r>
+        <w:rPr>
+          <w:color w:val="45B0E1" w:themeColor="accent1" w:themeTint="99"/>
+        </w:rPr>
+        <w:t>extracted</w:t>
+      </w:r>
+      <w:proofErr w:type="gramEnd"/>
+      <w:r>
+        <w:rPr>
+          <w:color w:val="45B0E1" w:themeColor="accent1" w:themeTint="99"/>
+        </w:rPr>
+        <w:t xml:space="preserve"> and the model is </w:t>
+      </w:r>
+      <w:proofErr w:type="gramStart"/>
+      <w:r>
+        <w:rPr>
+          <w:color w:val="45B0E1" w:themeColor="accent1" w:themeTint="99"/>
+        </w:rPr>
+        <w:t>refit</w:t>
+      </w:r>
+      <w:proofErr w:type="gramEnd"/>
+      <w:r>
+        <w:rPr>
+          <w:color w:val="45B0E1" w:themeColor="accent1" w:themeTint="99"/>
+        </w:rPr>
+        <w:t xml:space="preserve">. This step leads to a variation in the parameters across each of the bootstrap estimates. Thus, the betas and </w:t>
+      </w:r>
+      <w:proofErr w:type="spellStart"/>
+      <w:r>
+        <w:rPr>
+          <w:color w:val="45B0E1" w:themeColor="accent1" w:themeTint="99"/>
+        </w:rPr>
+        <w:t>sigmas</w:t>
+      </w:r>
+      <w:proofErr w:type="spellEnd"/>
+      <w:r>
+        <w:rPr>
+          <w:color w:val="45B0E1" w:themeColor="accent1" w:themeTint="99"/>
+        </w:rPr>
+        <w:t xml:space="preserve"> across replicates vary. What the simulation undertaken in the paper is meant to show is how both methods </w:t>
+      </w:r>
+      <w:proofErr w:type="gramStart"/>
+      <w:r>
+        <w:rPr>
+          <w:color w:val="45B0E1" w:themeColor="accent1" w:themeTint="99"/>
+        </w:rPr>
+        <w:t>actually lead</w:t>
+      </w:r>
+      <w:proofErr w:type="gramEnd"/>
+      <w:r>
+        <w:rPr>
+          <w:color w:val="45B0E1" w:themeColor="accent1" w:themeTint="99"/>
+        </w:rPr>
+        <w:t xml:space="preserve"> to an overestimation of the imputation’s true MSE as approximated by the empirical MSE. We have clarified this further in the text. </w:t>
+      </w:r>
+    </w:p>
+    <w:p>
+      <w:pPr>
+        <w:rPr>
+          <w:color w:val="45B0E1" w:themeColor="accent1" w:themeTint="99"/>
+        </w:rPr>
+      </w:pPr>
+      <w:r>
+        <w:t>5. The paper shows that using the empirical distribution of residuals helps reduce bias in poverty estimates, particularly when the residuals deviate from normality. However, there is no guarantee that the residual distribution observed in the base period will remain the same in subsequent periods. If the true residual distribution changes over time, applying the empirical distribution from the training data could introduce bias. This raises an important methodological question: when the shape of the residual distribution in the target period is unknown, is it appropriate to use the empirical residual distribution from the base survey for imputation?</w:t>
+      </w:r>
+    </w:p>
+    <w:p>
+      <w:pPr>
+        <w:rPr>
+          <w:color w:val="45B0E1" w:themeColor="accent1" w:themeTint="99"/>
+        </w:rPr>
+      </w:pPr>
+      <w:r>
+        <w:rPr>
+          <w:color w:val="45B0E1" w:themeColor="accent1" w:themeTint="99"/>
+        </w:rPr>
+        <w:t xml:space="preserve">This is </w:t>
+      </w:r>
+      <w:proofErr w:type="gramStart"/>
+      <w:r>
+        <w:rPr>
+          <w:color w:val="45B0E1" w:themeColor="accent1" w:themeTint="99"/>
+        </w:rPr>
+        <w:t>accurate, and</w:t>
+      </w:r>
+      <w:proofErr w:type="gramEnd"/>
+      <w:r>
+        <w:rPr>
+          <w:color w:val="45B0E1" w:themeColor="accent1" w:themeTint="99"/>
+        </w:rPr>
+        <w:t xml:space="preserve"> presents another reason as to why applying these methods over time is problematic and can lead to wrong predictions. </w:t>
+      </w:r>
+      <w:r>
+        <w:rPr>
+          <w:color w:val="45B0E1" w:themeColor="accent1" w:themeTint="99"/>
+        </w:rPr>
+        <w:t>In related work (Stemmler et al 2026) we illustrate how when imputing over time the largest contributor to biased estimates is the model’s betas, not the distribution of the errors.</w:t>
+      </w:r>
+      <w:r>
+        <w:rPr>
+          <w:color w:val="45B0E1" w:themeColor="accent1" w:themeTint="99"/>
+        </w:rPr>
+        <w:t xml:space="preserve"> We will add this to the manuscript.</w:t>
       </w:r>
     </w:p>
     <w:p/>
     <w:p>
       <w:r>
-        <w:t>4. Section 4.3 would benefit from additional clarification to make the argument clearer. First, the definitions and interpretations of empirical MSE and average estimated MSE should be stated explicitly. It would also help to specify that “BLUP” refers to the variance estimated using the parametric bootstrap approach, following the small-area estimation literature.</w:t>
-      </w:r>
-    </w:p>
-    <w:p>
-      <w:pPr>
-        <w:rPr>
-          <w:color w:val="45B0E1" w:themeColor="accent1" w:themeTint="99"/>
-        </w:rPr>
-      </w:pPr>
-      <w:r>
-        <w:rPr>
-          <w:color w:val="45B0E1" w:themeColor="accent1" w:themeTint="99"/>
-        </w:rPr>
-        <w:t xml:space="preserve">The MSE is estimated </w:t>
-      </w:r>
-      <w:proofErr w:type="gramStart"/>
-      <w:r>
-        <w:rPr>
-          <w:color w:val="45B0E1" w:themeColor="accent1" w:themeTint="99"/>
-        </w:rPr>
-        <w:t>following</w:t>
-      </w:r>
-      <w:proofErr w:type="gramEnd"/>
-      <w:r>
-        <w:rPr>
-          <w:color w:val="45B0E1" w:themeColor="accent1" w:themeTint="99"/>
-        </w:rPr>
-        <w:t xml:space="preserve"> standard statistical literature. The parametric bootstrap yields an estimate of the MSE. What figure 8 illustrates is </w:t>
-      </w:r>
-      <w:proofErr w:type="gramStart"/>
-      <w:r>
-        <w:rPr>
-          <w:color w:val="45B0E1" w:themeColor="accent1" w:themeTint="99"/>
-        </w:rPr>
-        <w:t>that in reality, the</w:t>
-      </w:r>
-      <w:proofErr w:type="gramEnd"/>
-      <w:r>
-        <w:rPr>
-          <w:color w:val="45B0E1" w:themeColor="accent1" w:themeTint="99"/>
-        </w:rPr>
-        <w:t xml:space="preserve"> typical noise measure used in MI as well as the noise estimated via a parametric bootstrap yield an upward biased estimate of the noise, in this case noted by the empirical MSE.</w:t>
-      </w:r>
-    </w:p>
-    <w:p/>
-    <w:p>
-      <w:r>
-        <w:t xml:space="preserve">The results suggest that MSEs obtained under the MI framework differ more from the true (empirical) MSE than those estimated by the parametric bootstrap. However, the last sentence of Section 4.3 states that “the variance estimated following Rubin’s rules will yield a downward-biased estimate of </w:t>
-      </w:r>
-      <w:r>
-        <w:lastRenderedPageBreak/>
-        <w:t>the true noise,” which seems inconsistent. A short explanation would clarify under which conditions Rubin’s rules underestimate or overestimate noise.</w:t>
-      </w:r>
-    </w:p>
-    <w:p>
-      <w:pPr>
-        <w:rPr>
-          <w:color w:val="45B0E1" w:themeColor="accent1" w:themeTint="99"/>
-        </w:rPr>
-      </w:pPr>
-      <w:r>
-        <w:rPr>
-          <w:color w:val="45B0E1" w:themeColor="accent1" w:themeTint="99"/>
-        </w:rPr>
-        <w:t>Thanks!</w:t>
-      </w:r>
-      <w:r>
-        <w:rPr>
-          <w:color w:val="45B0E1" w:themeColor="accent1" w:themeTint="99"/>
-        </w:rPr>
-        <w:t xml:space="preserve"> We will clarify in the text this issue. The problem arises because the MSE is the sum of the variance and the squared bias. Thus, if the estimates are biased, the second term will be larger and will underestimate the MSE.</w:t>
-      </w:r>
-    </w:p>
-    <w:p/>
-    <w:p>
-      <w:r>
-        <w:t>The paper rightly observes that the average estimated MSEs from both MI and BLUP are systematically larger than the empirical MSE because they are computed from smaller samples. In that case, the difference should not be interpreted as a bias—so MI or BLUP do not truly “overestimate” MSE. Instead, the result reflects a scale difference between population- and sample-based variances, which is not problematic.</w:t>
-      </w:r>
-    </w:p>
-    <w:p/>
-    <w:p>
-      <w:r>
-        <w:t xml:space="preserve">Finally, MI and parametric </w:t>
-      </w:r>
-      <w:proofErr w:type="gramStart"/>
-      <w:r>
-        <w:t>bootstrap</w:t>
-      </w:r>
-      <w:proofErr w:type="gramEnd"/>
-      <w:r>
-        <w:t xml:space="preserve"> inherently differ because MI incorporates the uncertainty of coefficient and variance estimates, whereas the parametric bootstrap treats them as fixed. The latter is appropriate when OLS estimates are consistent and the sample is large, as parameter uncertainty vanishes asymptotically. When sample sizes are limited, however, the parametric bootstrap may underestimate total MSE. Hence, MI-based MSEs are expected to be larger, but this does not imply superiority of one approach over the other. Including a short theoretical discussion on the asymptotic and small-sample properties of MI and the parametric bootstrap would help readers interpret the simulation results more effectively.</w:t>
-      </w:r>
-    </w:p>
-    <w:p>
-      <w:r>
-        <w:rPr>
-          <w:color w:val="45B0E1" w:themeColor="accent1" w:themeTint="99"/>
-        </w:rPr>
-        <w:t xml:space="preserve">Under the parametric bootstrap replicates the betas do vary. The survey’s betas are taken as the truth and are used to create multiple census data, where across the census data the only thing that varies </w:t>
-      </w:r>
-      <w:proofErr w:type="gramStart"/>
-      <w:r>
-        <w:rPr>
-          <w:color w:val="45B0E1" w:themeColor="accent1" w:themeTint="99"/>
-        </w:rPr>
-        <w:t>are</w:t>
-      </w:r>
-      <w:proofErr w:type="gramEnd"/>
-      <w:r>
-        <w:rPr>
-          <w:color w:val="45B0E1" w:themeColor="accent1" w:themeTint="99"/>
-        </w:rPr>
-        <w:t xml:space="preserve"> the simulated errors, but these still come from the </w:t>
-      </w:r>
-      <w:proofErr w:type="spellStart"/>
-      <w:r>
-        <w:rPr>
-          <w:color w:val="45B0E1" w:themeColor="accent1" w:themeTint="99"/>
-        </w:rPr>
-        <w:t>sigmas</w:t>
-      </w:r>
-      <w:proofErr w:type="spellEnd"/>
-      <w:r>
-        <w:rPr>
-          <w:color w:val="45B0E1" w:themeColor="accent1" w:themeTint="99"/>
-        </w:rPr>
-        <w:t xml:space="preserve"> estimated in the survey. Across each of these censuses, the survey sample is </w:t>
-      </w:r>
-      <w:proofErr w:type="gramStart"/>
-      <w:r>
-        <w:rPr>
-          <w:color w:val="45B0E1" w:themeColor="accent1" w:themeTint="99"/>
-        </w:rPr>
-        <w:t>extracted</w:t>
-      </w:r>
-      <w:proofErr w:type="gramEnd"/>
-      <w:r>
-        <w:rPr>
-          <w:color w:val="45B0E1" w:themeColor="accent1" w:themeTint="99"/>
-        </w:rPr>
-        <w:t xml:space="preserve"> and the model is </w:t>
-      </w:r>
-      <w:proofErr w:type="gramStart"/>
-      <w:r>
-        <w:rPr>
-          <w:color w:val="45B0E1" w:themeColor="accent1" w:themeTint="99"/>
-        </w:rPr>
-        <w:t>refit</w:t>
-      </w:r>
-      <w:proofErr w:type="gramEnd"/>
-      <w:r>
-        <w:rPr>
-          <w:color w:val="45B0E1" w:themeColor="accent1" w:themeTint="99"/>
-        </w:rPr>
-        <w:t xml:space="preserve">. This step leads to a variation in the parameters across each of the bootstrap estimates. Thus, the betas and </w:t>
-      </w:r>
-      <w:proofErr w:type="spellStart"/>
-      <w:r>
-        <w:rPr>
-          <w:color w:val="45B0E1" w:themeColor="accent1" w:themeTint="99"/>
-        </w:rPr>
-        <w:t>sigmas</w:t>
-      </w:r>
-      <w:proofErr w:type="spellEnd"/>
-      <w:r>
-        <w:rPr>
-          <w:color w:val="45B0E1" w:themeColor="accent1" w:themeTint="99"/>
-        </w:rPr>
-        <w:t xml:space="preserve"> across replicates vary. What the simulation undertaken in the paper is meant to show is how both methods </w:t>
-      </w:r>
-      <w:proofErr w:type="gramStart"/>
-      <w:r>
-        <w:rPr>
-          <w:color w:val="45B0E1" w:themeColor="accent1" w:themeTint="99"/>
-        </w:rPr>
-        <w:t>actually lead</w:t>
-      </w:r>
-      <w:proofErr w:type="gramEnd"/>
-      <w:r>
-        <w:rPr>
-          <w:color w:val="45B0E1" w:themeColor="accent1" w:themeTint="99"/>
-        </w:rPr>
-        <w:t xml:space="preserve"> to an overestimation of the imputation’s true MSE as approximated by the empirical MSE. We have clarified this further in the text. </w:t>
-      </w:r>
-    </w:p>
-    <w:p>
-      <w:pPr>
-        <w:rPr>
-          <w:color w:val="45B0E1" w:themeColor="accent1" w:themeTint="99"/>
-        </w:rPr>
-      </w:pPr>
-      <w:r>
-        <w:t>5. The paper shows that using the empirical distribution of residuals helps reduce bias in poverty estimates, particularly when the residuals deviate from normality. However, there is no guarantee that the residual distribution observed in the base period will remain the same in subsequent periods. If the true residual distribution changes over time, applying the empirical distribution from the training data could introduce bias. This raises an important methodological question: when the shape of the residual distribution in the target period is unknown, is it appropriate to use the empirical residual distribution from the base survey for imputation?</w:t>
-      </w:r>
-    </w:p>
-    <w:p>
-      <w:pPr>
-        <w:rPr>
-          <w:color w:val="45B0E1" w:themeColor="accent1" w:themeTint="99"/>
-        </w:rPr>
-      </w:pPr>
-      <w:r>
-        <w:rPr>
-          <w:color w:val="45B0E1" w:themeColor="accent1" w:themeTint="99"/>
-        </w:rPr>
-        <w:t xml:space="preserve">This is </w:t>
-      </w:r>
-      <w:proofErr w:type="gramStart"/>
-      <w:r>
-        <w:rPr>
-          <w:color w:val="45B0E1" w:themeColor="accent1" w:themeTint="99"/>
-        </w:rPr>
-        <w:t>accurate, and</w:t>
-      </w:r>
-      <w:proofErr w:type="gramEnd"/>
-      <w:r>
-        <w:rPr>
-          <w:color w:val="45B0E1" w:themeColor="accent1" w:themeTint="99"/>
-        </w:rPr>
-        <w:t xml:space="preserve"> presents another reason as to why applying these methods over time is problematic and can lead to wrong predictions. The same thing can be said about assuming normally distributed errors as is commonly done in </w:t>
-      </w:r>
-      <w:proofErr w:type="gramStart"/>
-      <w:r>
-        <w:rPr>
-          <w:color w:val="45B0E1" w:themeColor="accent1" w:themeTint="99"/>
-        </w:rPr>
-        <w:t>the literature</w:t>
-      </w:r>
-      <w:proofErr w:type="gramEnd"/>
-      <w:r>
-        <w:rPr>
-          <w:color w:val="45B0E1" w:themeColor="accent1" w:themeTint="99"/>
-        </w:rPr>
-        <w:t>. We will add this to the manuscript.</w:t>
-      </w:r>
-    </w:p>
-    <w:p/>
-    <w:p>
-      <w:r>
-        <w:lastRenderedPageBreak/>
         <w:t xml:space="preserve">Given this uncertainty, relying on empirical distribution might not always be the most robust choice. Since the normal distribution serves as an asymptotic approximation for many residual processes under standard regularity conditions, assuming normality could, in some cases, be a safer and more generalizable option. In other words, while using empirical residuals can improve fit within the same period, its validity across time depends critically on the stability of the error </w:t>
       </w:r>
       <w:proofErr w:type="gramStart"/>
@@ -918,7 +1595,6 @@
               <v:path gradientshapeok="t" o:connecttype="rect"/>
             </v:shapetype>
             <v:shape id="Text Box 2" o:spid="_x0000_s1026" type="#_x0000_t202" alt="Official Use Only" style="position:absolute;left:0;text-align:left;margin-left:40.95pt;margin-top:0;width:92.15pt;height:34.15pt;z-index:251659264;visibility:visible;mso-wrap-style:none;mso-wrap-distance-left:0;mso-wrap-distance-top:0;mso-wrap-distance-right:0;mso-wrap-distance-bottom:0;mso-position-horizontal:right;mso-position-horizontal-relative:page;mso-position-vertical:bottom;mso-position-vertical-relative:page;v-text-anchor:bottom" o:gfxdata="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" filled="f" stroked="f">
-              <v:fill o:detectmouseclick="t"/>
               <v:textbox style="mso-fit-shape-to-text:t" inset="0,0,20pt,15pt">
                 <w:txbxContent>
                   <w:p>
@@ -1049,7 +1725,6 @@
               <v:path gradientshapeok="t" o:connecttype="rect"/>
             </v:shapetype>
             <v:shape id="Text Box 3" o:spid="_x0000_s1027" type="#_x0000_t202" alt="Official Use Only" style="position:absolute;left:0;text-align:left;margin-left:40.95pt;margin-top:0;width:92.15pt;height:34.15pt;z-index:251660288;visibility:visible;mso-wrap-style:none;mso-wrap-distance-left:0;mso-wrap-distance-top:0;mso-wrap-distance-right:0;mso-wrap-distance-bottom:0;mso-position-horizontal:right;mso-position-horizontal-relative:page;mso-position-vertical:bottom;mso-position-vertical-relative:page;v-text-anchor:bottom" o:gfxdata="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" filled="f" stroked="f">
-              <v:fill o:detectmouseclick="t"/>
               <v:textbox style="mso-fit-shape-to-text:t" inset="0,0,20pt,15pt">
                 <w:txbxContent>
                   <w:p>
@@ -1180,7 +1855,6 @@
               <v:path gradientshapeok="t" o:connecttype="rect"/>
             </v:shapetype>
             <v:shape id="Text Box 1" o:spid="_x0000_s1028" type="#_x0000_t202" alt="Official Use Only" style="position:absolute;left:0;text-align:left;margin-left:40.95pt;margin-top:0;width:92.15pt;height:34.15pt;z-index:251658240;visibility:visible;mso-wrap-style:none;mso-wrap-distance-left:0;mso-wrap-distance-top:0;mso-wrap-distance-right:0;mso-wrap-distance-bottom:0;mso-position-horizontal:right;mso-position-horizontal-relative:page;mso-position-vertical:bottom;mso-position-vertical-relative:page;v-text-anchor:bottom" o:gfxdata="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" filled="f" stroked="f">
-              <v:fill o:detectmouseclick="t"/>
               <v:textbox style="mso-fit-shape-to-text:t" inset="0,0,20pt,15pt">
                 <w:txbxContent>
                   <w:p>

</xml_diff>

<commit_message>
Updates to codes and manuscript
</commit_message>
<xml_diff>
--- a/4.writeup/Reviewers.docx
+++ b/4.writeup/Reviewers.docx
@@ -29,23 +29,7 @@
     </w:p>
     <w:p>
       <w:r>
-        <w:t xml:space="preserve">This </w:t>
-      </w:r>
-      <w:proofErr w:type="gramStart"/>
-      <w:r>
-        <w:t>paper  evaluates</w:t>
-      </w:r>
-      <w:proofErr w:type="gramEnd"/>
-      <w:r>
-        <w:t xml:space="preserve"> various strategies to conduct survey-to-survey imputation methods to predict poverty, which have been applied to various data-poor contexts in the developing world. The paper presents the results from extensive simulation exercises under different error distributions, biases sample, and other conditions. The paper offers </w:t>
-      </w:r>
-      <w:proofErr w:type="gramStart"/>
-      <w:r>
-        <w:t>a number of</w:t>
-      </w:r>
-      <w:proofErr w:type="gramEnd"/>
-      <w:r>
-        <w:t xml:space="preserve"> recommendations to practitioners.</w:t>
+        <w:t>This paper  evaluates various strategies to conduct survey-to-survey imputation methods to predict poverty, which have been applied to various data-poor contexts in the developing world. The paper presents the results from extensive simulation exercises under different error distributions, biases sample, and other conditions. The paper offers a number of recommendations to practitioners.</w:t>
       </w:r>
     </w:p>
     <w:p/>
@@ -56,31 +40,7 @@
     </w:p>
     <w:p>
       <w:r>
-        <w:t xml:space="preserve">While I appreciate the purpose of the paper, the contribution of the paper is limited at best. There is no theoretical </w:t>
-      </w:r>
-      <w:proofErr w:type="gramStart"/>
-      <w:r>
-        <w:t>contribution</w:t>
-      </w:r>
-      <w:proofErr w:type="gramEnd"/>
-      <w:r>
-        <w:t xml:space="preserve"> and the practical relevance of the paper is debatable, which I </w:t>
-      </w:r>
-      <w:proofErr w:type="gramStart"/>
-      <w:r>
-        <w:t>elaborate</w:t>
-      </w:r>
-      <w:proofErr w:type="gramEnd"/>
-      <w:r>
-        <w:t xml:space="preserve"> </w:t>
-      </w:r>
-      <w:proofErr w:type="gramStart"/>
-      <w:r>
-        <w:t>in</w:t>
-      </w:r>
-      <w:proofErr w:type="gramEnd"/>
-      <w:r>
-        <w:t xml:space="preserve"> the next point.</w:t>
+        <w:t>While I appreciate the purpose of the paper, the contribution of the paper is limited at best. There is no theoretical contribution and the practical relevance of the paper is debatable, which I elaborate in the next point.</w:t>
       </w:r>
     </w:p>
     <w:p/>
@@ -104,63 +64,13 @@
         <w:rPr>
           <w:color w:val="45B0E1" w:themeColor="accent1" w:themeTint="99"/>
         </w:rPr>
-        <w:t xml:space="preserve">Thanks. In line with other </w:t>
-      </w:r>
-      <w:proofErr w:type="gramStart"/>
-      <w:r>
-        <w:rPr>
-          <w:color w:val="45B0E1" w:themeColor="accent1" w:themeTint="99"/>
-        </w:rPr>
-        <w:t>comments</w:t>
-      </w:r>
-      <w:proofErr w:type="gramEnd"/>
-      <w:r>
-        <w:rPr>
-          <w:color w:val="45B0E1" w:themeColor="accent1" w:themeTint="99"/>
-        </w:rPr>
-        <w:t xml:space="preserve"> we’ve modified the DGP so we can add results from a different DGP. We’ve also added some results based on real world data. We’ve taken the Mexican </w:t>
-      </w:r>
-      <w:proofErr w:type="spellStart"/>
-      <w:r>
-        <w:rPr>
-          <w:color w:val="45B0E1" w:themeColor="accent1" w:themeTint="99"/>
-        </w:rPr>
-        <w:t>intercensus</w:t>
-      </w:r>
-      <w:proofErr w:type="spellEnd"/>
-      <w:r>
-        <w:rPr>
-          <w:color w:val="45B0E1" w:themeColor="accent1" w:themeTint="99"/>
-        </w:rPr>
-        <w:t xml:space="preserve"> survey as detailed in Corral et al. (2021) and applied different errors (normal, </w:t>
-      </w:r>
-      <w:proofErr w:type="spellStart"/>
-      <w:r>
-        <w:rPr>
-          <w:color w:val="45B0E1" w:themeColor="accent1" w:themeTint="99"/>
-        </w:rPr>
-        <w:t>non normal</w:t>
-      </w:r>
-      <w:proofErr w:type="spellEnd"/>
-      <w:r>
-        <w:rPr>
-          <w:color w:val="45B0E1" w:themeColor="accent1" w:themeTint="99"/>
-        </w:rPr>
-        <w:t>, heteroskedastic) to the linear portion of the model to further emphasize some of the results. We understand that these additions are not exhaustive, and will clarify as such in the document, but they do lend further credence to the findings.</w:t>
+        <w:t>Thanks. In line with other comments we’ve modified the DGP so we can add results from a different DGP. We’ve also added some results based on real world data. We’ve taken the Mexican intercensus survey as detailed in Corral et al. (2021) and applied different errors (normal, non normal, heteroskedastic) to the linear portion of the model to further emphasize some of the results. We understand that these additions are not exhaustive, and will clarify as such in the document, but they do lend further credence to the findings.</w:t>
       </w:r>
     </w:p>
     <w:p/>
     <w:p>
       <w:r>
-        <w:t xml:space="preserve">Even if the DGP is justifiable, it is also unclear to what extent the performance ranking based on this </w:t>
-      </w:r>
-      <w:proofErr w:type="gramStart"/>
-      <w:r>
-        <w:t>particular DGP</w:t>
-      </w:r>
-      <w:proofErr w:type="gramEnd"/>
-      <w:r>
-        <w:t xml:space="preserve"> is applicable to a wide range of contexts where survey-to-survey imputation is used. While the conclusions the authors draw in this paper are not unreasonable, the logical connection between the simulation results and the conclusions in Section 5 is weak.</w:t>
+        <w:t>Even if the DGP is justifiable, it is also unclear to what extent the performance ranking based on this particular DGP is applicable to a wide range of contexts where survey-to-survey imputation is used. While the conclusions the authors draw in this paper are not unreasonable, the logical connection between the simulation results and the conclusions in Section 5 is weak.</w:t>
       </w:r>
     </w:p>
     <w:p>
@@ -179,68 +89,30 @@
     <w:p/>
     <w:p>
       <w:r>
-        <w:t xml:space="preserve">Relatedly, it appears to me </w:t>
-      </w:r>
-      <w:proofErr w:type="gramStart"/>
-      <w:r>
-        <w:t>all of</w:t>
-      </w:r>
-      <w:proofErr w:type="gramEnd"/>
-      <w:r>
-        <w:t xml:space="preserve"> the seven recommendations in Section 5 are generic and can be derived without the extensive simulations conducted in the paper. The paper would be much more </w:t>
+        <w:t xml:space="preserve">Relatedly, it appears to me all of the seven recommendations in Section 5 are generic and can be derived without the extensive simulations conducted in the paper. The paper would be much more </w:t>
       </w:r>
       <w:r>
         <w:lastRenderedPageBreak/>
-        <w:t xml:space="preserve">valuable if the simulations </w:t>
-      </w:r>
-      <w:proofErr w:type="gramStart"/>
-      <w:r>
-        <w:t>are</w:t>
-      </w:r>
-      <w:proofErr w:type="gramEnd"/>
-      <w:r>
-        <w:t xml:space="preserve"> done in a more realistic context and identify a set of particularly important pitfalls.</w:t>
-      </w:r>
-    </w:p>
-    <w:p>
-      <w:pPr>
-        <w:rPr>
-          <w:color w:val="45B0E1" w:themeColor="accent1" w:themeTint="99"/>
-        </w:rPr>
-      </w:pPr>
-      <w:r>
-        <w:rPr>
-          <w:color w:val="45B0E1" w:themeColor="accent1" w:themeTint="99"/>
-        </w:rPr>
-        <w:t xml:space="preserve">Thank you. We have added real world data simulations to the paper. Despite the simplicity of the simulations illustrated, we feel that illustrating how under the model’s underlying assumptions these predictions may easily fail raises considerable questions on the method’s validity as applied in some scenarios. When applied to real world data and bringing in an additional component of changes across time, there are many things that are changing and could lead to the identified biases cancelling out or even compounding. Given the fact that these methods are applied when the true point estimates are unavailable, it is impossible for people to know if the biases have </w:t>
-      </w:r>
-      <w:proofErr w:type="gramStart"/>
-      <w:r>
-        <w:rPr>
-          <w:color w:val="45B0E1" w:themeColor="accent1" w:themeTint="99"/>
-        </w:rPr>
-        <w:t>cancelled out</w:t>
-      </w:r>
-      <w:proofErr w:type="gramEnd"/>
-      <w:r>
-        <w:rPr>
-          <w:color w:val="45B0E1" w:themeColor="accent1" w:themeTint="99"/>
-        </w:rPr>
-        <w:t xml:space="preserve"> or compounded. Thus, we feel it is important for practitioners to understand and recognize the potential failings of the method.</w:t>
+        <w:t>valuable if the simulations are done in a more realistic context and identify a set of particularly important pitfalls.</w:t>
+      </w:r>
+    </w:p>
+    <w:p>
+      <w:pPr>
+        <w:rPr>
+          <w:color w:val="45B0E1" w:themeColor="accent1" w:themeTint="99"/>
+        </w:rPr>
+      </w:pPr>
+      <w:r>
+        <w:rPr>
+          <w:color w:val="45B0E1" w:themeColor="accent1" w:themeTint="99"/>
+        </w:rPr>
+        <w:t>Thank you. We have added real world data simulations to the paper. Despite the simplicity of the simulations illustrated, we feel that illustrating how under the model’s underlying assumptions these predictions may easily fail raises considerable questions on the method’s validity as applied in some scenarios. When applied to real world data and bringing in an additional component of changes across time, there are many things that are changing and could lead to the identified biases cancelling out or even compounding. Given the fact that these methods are applied when the true point estimates are unavailable, it is impossible for people to know if the biases have cancelled out or compounded. Thus, we feel it is important for practitioners to understand and recognize the potential failings of the method.</w:t>
       </w:r>
     </w:p>
     <w:p/>
     <w:p>
       <w:r>
-        <w:t xml:space="preserve">I also have several other reservations. First, this paper almost exclusively </w:t>
-      </w:r>
-      <w:proofErr w:type="gramStart"/>
-      <w:r>
-        <w:t>focus</w:t>
-      </w:r>
-      <w:proofErr w:type="gramEnd"/>
-      <w:r>
-        <w:t xml:space="preserve"> on bias. However, I would argue that MSE is at least as important as bias. An unbiased but very noisy estimator is arguably not as good as precise but slightly biased estimator.  </w:t>
+        <w:t xml:space="preserve">I also have several other reservations. First, this paper almost exclusively focus on bias. However, I would argue that MSE is at least as important as bias. An unbiased but very noisy estimator is arguably not as good as precise but slightly biased estimator.  </w:t>
       </w:r>
     </w:p>
     <w:p>
@@ -308,63 +180,44 @@
         <w:rPr>
           <w:color w:val="45B0E1" w:themeColor="accent1" w:themeTint="99"/>
         </w:rPr>
-        <w:t xml:space="preserve">have fixed </w:t>
-      </w:r>
-      <w:proofErr w:type="gramStart"/>
-      <w:r>
-        <w:rPr>
-          <w:color w:val="45B0E1" w:themeColor="accent1" w:themeTint="99"/>
-        </w:rPr>
-        <w:t>these</w:t>
-      </w:r>
-      <w:r>
-        <w:rPr>
-          <w:color w:val="45B0E1" w:themeColor="accent1" w:themeTint="99"/>
-        </w:rPr>
-        <w:t xml:space="preserve"> </w:t>
-      </w:r>
-      <w:proofErr w:type="spellStart"/>
-      <w:r>
-        <w:rPr>
-          <w:color w:val="45B0E1" w:themeColor="accent1" w:themeTint="99"/>
-        </w:rPr>
-        <w:t>these</w:t>
-      </w:r>
-      <w:proofErr w:type="spellEnd"/>
-      <w:proofErr w:type="gramEnd"/>
-      <w:r>
-        <w:rPr>
-          <w:color w:val="45B0E1" w:themeColor="accent1" w:themeTint="99"/>
-        </w:rPr>
-        <w:t>.</w:t>
+        <w:t>have fixed these</w:t>
+      </w:r>
+      <w:r>
+        <w:rPr>
+          <w:color w:val="45B0E1" w:themeColor="accent1" w:themeTint="99"/>
+        </w:rPr>
+        <w:t xml:space="preserve"> these.</w:t>
       </w:r>
     </w:p>
     <w:p/>
     <w:p>
       <w:r>
-        <w:t xml:space="preserve">Also, the interpretation of </w:t>
-      </w:r>
-      <w:proofErr w:type="gramStart"/>
-      <w:r>
-        <w:t>eq.(</w:t>
-      </w:r>
-      <w:proofErr w:type="gramEnd"/>
-      <w:r>
-        <w:t>5) does not seem correct. How could the population parameter be determined by parameter estimates? Also, \bar{X}_{target} looks like the sample mean but this ought to be the population mean if the LHS is supposed to be the population parameter.</w:t>
+        <w:t>Also, the interpretation of eq.(5) does not seem correct. How could the population parameter be determined by parameter estimates? Also, \bar{X}_{target} looks like the sample mean but this ought to be the population mean if the LHS is supposed to be the population parameter.</w:t>
+      </w:r>
+    </w:p>
+    <w:p>
+      <w:pPr>
+        <w:rPr>
+          <w:color w:val="45B0E1" w:themeColor="accent1" w:themeTint="99"/>
+        </w:rPr>
+      </w:pPr>
+      <w:r>
+        <w:rPr>
+          <w:color w:val="45B0E1" w:themeColor="accent1" w:themeTint="99"/>
+        </w:rPr>
+        <w:t>We have removed this section.</w:t>
+      </w:r>
+      <w:r>
+        <w:rPr>
+          <w:color w:val="45B0E1" w:themeColor="accent1" w:themeTint="99"/>
+        </w:rPr>
+        <w:t xml:space="preserve"> We felt we can make our point without it.</w:t>
       </w:r>
     </w:p>
     <w:p/>
     <w:p>
       <w:r>
-        <w:t xml:space="preserve">Third, the sampling is quite problematic to me. If I understand correctly, both the source and target are 20 percent simple random </w:t>
-      </w:r>
-      <w:proofErr w:type="gramStart"/>
-      <w:r>
-        <w:t>sample</w:t>
-      </w:r>
-      <w:proofErr w:type="gramEnd"/>
-      <w:r>
-        <w:t xml:space="preserve"> of the data. This means that 20 percent of the source survey appears in the target survey and vice versa. This is highly unrealistic. In a practical setting, there is no overlap.</w:t>
+        <w:t>Third, the sampling is quite problematic to me. If I understand correctly, both the source and target are 20 percent simple random sample of the data. This means that 20 percent of the source survey appears in the target survey and vice versa. This is highly unrealistic. In a practical setting, there is no overlap.</w:t>
       </w:r>
     </w:p>
     <w:p>
@@ -383,15 +236,7 @@
     <w:p/>
     <w:p>
       <w:r>
-        <w:t>Finally, a very minor point.  + is repeated in Eq (10) before \</w:t>
-      </w:r>
-      <w:proofErr w:type="spellStart"/>
-      <w:r>
-        <w:t>eta_a</w:t>
-      </w:r>
-      <w:proofErr w:type="spellEnd"/>
-      <w:r>
-        <w:t>.</w:t>
+        <w:t>Finally, a very minor point.  + is repeated in Eq (10) before \eta_a.</w:t>
       </w:r>
     </w:p>
     <w:p/>
@@ -403,23 +248,7 @@
     <w:p>
       <w:r>
         <w:lastRenderedPageBreak/>
-        <w:t xml:space="preserve">I suggest that the authors choose a realistic DGP in a particular country that ideally has at least two rounds of survey. Pick a parsimonious consumption model with five or so covariates (as with the current model). Ideally, these covariates are often chosen in consumption models elsewhere and mix </w:t>
-      </w:r>
-      <w:proofErr w:type="gramStart"/>
-      <w:r>
-        <w:t>discrete</w:t>
-      </w:r>
-      <w:proofErr w:type="gramEnd"/>
-      <w:r>
-        <w:t xml:space="preserve"> and continuous variables. Then, calibrate the DGP to mimic the empirical distribution of both covariates and outcomes. By doing this for two rounds, it would be possible to shed some light on some of the recommendations in the conclusion. Population and sample sizes should be calibrated at realistic levels (in the current setup, the sample size is ok, but the population size is way too small). In this way, the authors can still fully control data generation, but the results have at least some </w:t>
-      </w:r>
-      <w:proofErr w:type="gramStart"/>
-      <w:r>
-        <w:t>resemblance</w:t>
-      </w:r>
-      <w:proofErr w:type="gramEnd"/>
-      <w:r>
-        <w:t xml:space="preserve"> to the country that they chose.</w:t>
+        <w:t>I suggest that the authors choose a realistic DGP in a particular country that ideally has at least two rounds of survey. Pick a parsimonious consumption model with five or so covariates (as with the current model). Ideally, these covariates are often chosen in consumption models elsewhere and mix discrete and continuous variables. Then, calibrate the DGP to mimic the empirical distribution of both covariates and outcomes. By doing this for two rounds, it would be possible to shed some light on some of the recommendations in the conclusion. Population and sample sizes should be calibrated at realistic levels (in the current setup, the sample size is ok, but the population size is way too small). In this way, the authors can still fully control data generation, but the results have at least some resemblance to the country that they chose.</w:t>
       </w:r>
     </w:p>
     <w:p>
@@ -440,8 +269,21 @@
         </w:rPr>
         <w:t>. We’ve used Mexican data as presented in Corral et al (2021) and Corral, Henderson and Segovia (2025) to run our simulations.</w:t>
       </w:r>
-    </w:p>
-    <w:p/>
+      <w:r>
+        <w:rPr>
+          <w:color w:val="45B0E1" w:themeColor="accent1" w:themeTint="99"/>
+        </w:rPr>
+        <w:t xml:space="preserve"> The advantage of this is that the intracensal survey is treated as a census of roughly 3.9 million households, from which we draw over 500 samples. One of these samples is randomly chosen to fit the model. The model is then fit to the remaining 500 samples to obtain bias and noise estimates.</w:t>
+      </w:r>
+    </w:p>
+    <w:p>
+      <w:r>
+        <w:rPr>
+          <w:color w:val="45B0E1" w:themeColor="accent1" w:themeTint="99"/>
+        </w:rPr>
+        <w:t>Regarding the reviewer’s recommendation for testing with two rounds, we (the same author team) have a separate paper which delves more into the issues of imputation over time using Peruvian data.</w:t>
+      </w:r>
+    </w:p>
     <w:p>
       <w:r>
         <w:t>In the current simulation, all the covariates are independent of each other. This would be a natural starting point, but I would encourage the authors to consider allowing for some correlations between covariates. If two variables are highly correlated, omission of one of the two may not be as serious as the omission of some other covariates.</w:t>
@@ -457,21 +299,7 @@
         <w:rPr>
           <w:color w:val="45B0E1" w:themeColor="accent1" w:themeTint="99"/>
         </w:rPr>
-        <w:t xml:space="preserve">Thanks, </w:t>
-      </w:r>
-      <w:proofErr w:type="gramStart"/>
-      <w:r>
-        <w:rPr>
-          <w:color w:val="45B0E1" w:themeColor="accent1" w:themeTint="99"/>
-        </w:rPr>
-        <w:t>in</w:t>
-      </w:r>
-      <w:proofErr w:type="gramEnd"/>
-      <w:r>
-        <w:rPr>
-          <w:color w:val="45B0E1" w:themeColor="accent1" w:themeTint="99"/>
-        </w:rPr>
-        <w:t xml:space="preserve"> the current simulations we have 2 covariates that are correlated. In the Mexican data, correlations are also present.</w:t>
+        <w:t>Thanks, in the current simulations we have 2 covariates that are correlated. In the Mexican data, correlations are also present.</w:t>
       </w:r>
     </w:p>
     <w:p/>
@@ -556,15 +384,7 @@
       </w:r>
       <w:r>
         <w:lastRenderedPageBreak/>
-        <w:t>positive shock improves household welfare (</w:t>
-      </w:r>
-      <w:proofErr w:type="gramStart"/>
-      <w:r>
-        <w:t>mean</w:t>
-      </w:r>
-      <w:proofErr w:type="gramEnd"/>
-      <w:r>
-        <w:t xml:space="preserve"> log expenditure, ln y, rises from 3.98 to 4.03 as the mean shock declines from 0.4 to 0.2), yet the share of households consuming eggs falls from 0.30 to 0.28. Consequently, the model predicts a higher poverty rate despite an actual improvement in welfare.</w:t>
+        <w:t>positive shock improves household welfare (mean log expenditure, ln y, rises from 3.98 to 4.03 as the mean shock declines from 0.4 to 0.2), yet the share of households consuming eggs falls from 0.30 to 0.28. Consequently, the model predicts a higher poverty rate despite an actual improvement in welfare.</w:t>
       </w:r>
     </w:p>
     <w:p>
@@ -600,42 +420,7 @@
         <w:rPr>
           <w:color w:val="45B0E1" w:themeColor="accent1" w:themeTint="99"/>
         </w:rPr>
-        <w:t xml:space="preserve">We are indicating how eggs </w:t>
-      </w:r>
-      <w:proofErr w:type="gramStart"/>
-      <w:r>
-        <w:rPr>
-          <w:color w:val="45B0E1" w:themeColor="accent1" w:themeTint="99"/>
-        </w:rPr>
-        <w:t>is</w:t>
-      </w:r>
-      <w:proofErr w:type="gramEnd"/>
-      <w:r>
-        <w:rPr>
-          <w:color w:val="45B0E1" w:themeColor="accent1" w:themeTint="99"/>
-        </w:rPr>
-        <w:t xml:space="preserve"> affected by the omission of conflict. This is </w:t>
-      </w:r>
-      <w:proofErr w:type="gramStart"/>
-      <w:r>
-        <w:rPr>
-          <w:color w:val="45B0E1" w:themeColor="accent1" w:themeTint="99"/>
-        </w:rPr>
-        <w:t>similar to</w:t>
-      </w:r>
-      <w:proofErr w:type="gramEnd"/>
-      <w:r>
-        <w:rPr>
-          <w:color w:val="45B0E1" w:themeColor="accent1" w:themeTint="99"/>
-        </w:rPr>
-        <w:t xml:space="preserve"> Wooldridge’s (2010 </w:t>
-      </w:r>
-      <w:proofErr w:type="spellStart"/>
-      <w:r>
-        <w:rPr>
-          <w:color w:val="45B0E1" w:themeColor="accent1" w:themeTint="99"/>
-        </w:rPr>
-        <w:t>p</w:t>
+        <w:t>We are indicating how eggs is affected by the omission of conflict. This is similar to Wooldridge’s (2010 p</w:t>
       </w:r>
       <w:r>
         <w:rPr>
@@ -643,60 +428,17 @@
         </w:rPr>
         <w:t>XX</w:t>
       </w:r>
-      <w:proofErr w:type="spellEnd"/>
-      <w:r>
-        <w:rPr>
-          <w:color w:val="45B0E1" w:themeColor="accent1" w:themeTint="99"/>
-        </w:rPr>
-        <w:t xml:space="preserve">) example on how omitting ability from the regression impacts the coefficient for education. In our example, eggs </w:t>
-      </w:r>
-      <w:proofErr w:type="gramStart"/>
-      <w:r>
-        <w:rPr>
-          <w:color w:val="45B0E1" w:themeColor="accent1" w:themeTint="99"/>
-        </w:rPr>
-        <w:t>is</w:t>
-      </w:r>
-      <w:proofErr w:type="gramEnd"/>
-      <w:r>
-        <w:rPr>
-          <w:color w:val="45B0E1" w:themeColor="accent1" w:themeTint="99"/>
-        </w:rPr>
-        <w:t xml:space="preserve"> in place of education and conflict is akin to ability.</w:t>
-      </w:r>
-      <w:r>
-        <w:rPr>
-          <w:color w:val="45B0E1" w:themeColor="accent1" w:themeTint="99"/>
-        </w:rPr>
-        <w:t xml:space="preserve"> A valid proxy for conflict would be </w:t>
-      </w:r>
-      <w:proofErr w:type="gramStart"/>
-      <w:r>
-        <w:rPr>
-          <w:color w:val="45B0E1" w:themeColor="accent1" w:themeTint="99"/>
-        </w:rPr>
-        <w:t>battle</w:t>
-      </w:r>
-      <w:proofErr w:type="gramEnd"/>
-      <w:r>
-        <w:rPr>
-          <w:color w:val="45B0E1" w:themeColor="accent1" w:themeTint="99"/>
-        </w:rPr>
-        <w:t xml:space="preserve"> deaths </w:t>
-      </w:r>
-      <w:proofErr w:type="gramStart"/>
-      <w:r>
-        <w:rPr>
-          <w:color w:val="45B0E1" w:themeColor="accent1" w:themeTint="99"/>
-        </w:rPr>
-        <w:t>in a given</w:t>
-      </w:r>
-      <w:proofErr w:type="gramEnd"/>
-      <w:r>
-        <w:rPr>
-          <w:color w:val="45B0E1" w:themeColor="accent1" w:themeTint="99"/>
-        </w:rPr>
-        <w:t xml:space="preserve"> proximity to the household.</w:t>
+      <w:r>
+        <w:rPr>
+          <w:color w:val="45B0E1" w:themeColor="accent1" w:themeTint="99"/>
+        </w:rPr>
+        <w:t>) example on how omitting ability from the regression impacts the coefficient for education. In our example, eggs is in place of education and conflict is akin to ability.</w:t>
+      </w:r>
+      <w:r>
+        <w:rPr>
+          <w:color w:val="45B0E1" w:themeColor="accent1" w:themeTint="99"/>
+        </w:rPr>
+        <w:t xml:space="preserve"> A valid proxy for conflict would be battle deaths in a given proximity to the household.</w:t>
       </w:r>
     </w:p>
     <w:p>
@@ -721,21 +463,7 @@
         <w:rPr>
           <w:color w:val="45B0E1" w:themeColor="accent1" w:themeTint="99"/>
         </w:rPr>
-        <w:t xml:space="preserve"> </w:t>
-      </w:r>
-      <w:proofErr w:type="gramStart"/>
-      <w:r>
-        <w:rPr>
-          <w:color w:val="45B0E1" w:themeColor="accent1" w:themeTint="99"/>
-        </w:rPr>
-        <w:t>to use</w:t>
-      </w:r>
-      <w:proofErr w:type="gramEnd"/>
-      <w:r>
-        <w:rPr>
-          <w:color w:val="45B0E1" w:themeColor="accent1" w:themeTint="99"/>
-        </w:rPr>
-        <w:t xml:space="preserve"> a food consumption dummy as a proxy variable as it </w:t>
+        <w:t xml:space="preserve"> to use a food consumption dummy as a proxy variable as it </w:t>
       </w:r>
       <w:r>
         <w:rPr>
@@ -753,21 +481,7 @@
         <w:rPr>
           <w:color w:val="45B0E1" w:themeColor="accent1" w:themeTint="99"/>
         </w:rPr>
-        <w:t xml:space="preserve"> the conditions required for a </w:t>
-      </w:r>
-      <w:proofErr w:type="gramStart"/>
-      <w:r>
-        <w:rPr>
-          <w:color w:val="45B0E1" w:themeColor="accent1" w:themeTint="99"/>
-        </w:rPr>
-        <w:t>proxy variable</w:t>
-      </w:r>
-      <w:proofErr w:type="gramEnd"/>
-      <w:r>
-        <w:rPr>
-          <w:color w:val="45B0E1" w:themeColor="accent1" w:themeTint="99"/>
-        </w:rPr>
-        <w:t xml:space="preserve"> to be valid. </w:t>
+        <w:t xml:space="preserve"> the conditions required for a proxy variable to be valid. </w:t>
       </w:r>
       <w:r>
         <w:rPr>
@@ -884,21 +598,7 @@
         <w:rPr>
           <w:color w:val="45B0E1" w:themeColor="accent1" w:themeTint="99"/>
         </w:rPr>
-        <w:t xml:space="preserve">broader </w:t>
-      </w:r>
-      <w:proofErr w:type="spellStart"/>
-      <w:r>
-        <w:rPr>
-          <w:color w:val="45B0E1" w:themeColor="accent1" w:themeTint="99"/>
-        </w:rPr>
-        <w:t>phenomen</w:t>
-      </w:r>
-      <w:proofErr w:type="spellEnd"/>
-      <w:r>
-        <w:rPr>
-          <w:color w:val="45B0E1" w:themeColor="accent1" w:themeTint="99"/>
-        </w:rPr>
-        <w:t xml:space="preserve"> like </w:t>
+        <w:t xml:space="preserve">broader phenomen like </w:t>
       </w:r>
       <w:r>
         <w:rPr>
@@ -946,15 +646,7 @@
     </w:p>
     <w:p>
       <w:r>
-        <w:t xml:space="preserve">Empirical evidence from multiple studies—such as Stifel and Christiaensen (2007), Christiaensen et al. (2012), </w:t>
-      </w:r>
-      <w:proofErr w:type="spellStart"/>
-      <w:r>
-        <w:t>Douidich</w:t>
-      </w:r>
-      <w:proofErr w:type="spellEnd"/>
-      <w:r>
-        <w:t xml:space="preserve"> et al. (2013), and Yoshida et al. (2022)—shows that S2S models can closely replicate direct survey-based poverty estimates. More recently, Dang et al. (2025) demonstrate that, even under a randomized experimental design, an S2S model trained on pre-pandemic data </w:t>
+        <w:t xml:space="preserve">Empirical evidence from multiple studies—such as Stifel and Christiaensen (2007), Christiaensen et al. (2012), Douidich et al. (2013), and Yoshida et al. (2022)—shows that S2S models can closely replicate direct survey-based poverty estimates. More recently, Dang et al. (2025) demonstrate that, even under a randomized experimental design, an S2S model trained on pre-pandemic data </w:t>
       </w:r>
       <w:r>
         <w:lastRenderedPageBreak/>
@@ -983,23 +675,7 @@
     <w:p/>
     <w:p>
       <w:r>
-        <w:t xml:space="preserve">2. This paper suggests that S2S fails if the model stability is violated, but is this true? Even if one parameter changes over time, the changes in other parameters can offset it, and as a result, a model trained in one round of survey can predict poverty rates accurately in later rounds. An empirical assessment </w:t>
-      </w:r>
-      <w:proofErr w:type="gramStart"/>
-      <w:r>
-        <w:t>on</w:t>
-      </w:r>
-      <w:proofErr w:type="gramEnd"/>
-      <w:r>
-        <w:t xml:space="preserve"> this is shown in Yoshida et al. 2022 (Table 5). Even though the percentage of stable coefficients is less than 70 percent, the model can predict poverty rates well in the testing data. This does not reduce the value of the analysis in this paper, but it will be useful to add caveats when it discusses the relationship between the </w:t>
-      </w:r>
-      <w:proofErr w:type="gramStart"/>
-      <w:r>
-        <w:t>model stability</w:t>
-      </w:r>
-      <w:proofErr w:type="gramEnd"/>
-      <w:r>
-        <w:t xml:space="preserve"> and the accuracy of the S2S.</w:t>
+        <w:t>2. This paper suggests that S2S fails if the model stability is violated, but is this true? Even if one parameter changes over time, the changes in other parameters can offset it, and as a result, a model trained in one round of survey can predict poverty rates accurately in later rounds. An empirical assessment on this is shown in Yoshida et al. 2022 (Table 5). Even though the percentage of stable coefficients is less than 70 percent, the model can predict poverty rates well in the testing data. This does not reduce the value of the analysis in this paper, but it will be useful to add caveats when it discusses the relationship between the model stability and the accuracy of the S2S.</w:t>
       </w:r>
     </w:p>
     <w:p>
@@ -1018,49 +694,7 @@
         <w:rPr>
           <w:color w:val="45B0E1" w:themeColor="accent1" w:themeTint="99"/>
         </w:rPr>
-        <w:t xml:space="preserve">These studies fail to indicate how many models </w:t>
-      </w:r>
-      <w:proofErr w:type="gramStart"/>
-      <w:r>
-        <w:rPr>
-          <w:color w:val="45B0E1" w:themeColor="accent1" w:themeTint="99"/>
-        </w:rPr>
-        <w:t>were fit</w:t>
-      </w:r>
-      <w:proofErr w:type="gramEnd"/>
-      <w:r>
-        <w:rPr>
-          <w:color w:val="45B0E1" w:themeColor="accent1" w:themeTint="99"/>
-        </w:rPr>
-        <w:t xml:space="preserve"> until the right one was obtained. In upcoming </w:t>
-      </w:r>
-      <w:proofErr w:type="gramStart"/>
-      <w:r>
-        <w:rPr>
-          <w:color w:val="45B0E1" w:themeColor="accent1" w:themeTint="99"/>
-        </w:rPr>
-        <w:t>work</w:t>
-      </w:r>
-      <w:proofErr w:type="gramEnd"/>
-      <w:r>
-        <w:rPr>
-          <w:color w:val="45B0E1" w:themeColor="accent1" w:themeTint="99"/>
-        </w:rPr>
-        <w:t xml:space="preserve"> we highlight how these methods fail to predict changes in poverty in </w:t>
-      </w:r>
-      <w:proofErr w:type="gramStart"/>
-      <w:r>
-        <w:rPr>
-          <w:color w:val="45B0E1" w:themeColor="accent1" w:themeTint="99"/>
-        </w:rPr>
-        <w:t>the Peru</w:t>
-      </w:r>
-      <w:proofErr w:type="gramEnd"/>
-      <w:r>
-        <w:rPr>
-          <w:color w:val="45B0E1" w:themeColor="accent1" w:themeTint="99"/>
-        </w:rPr>
-        <w:t xml:space="preserve">. The simulations presented here are useful to illustrate how easy it is for these methods to fail. </w:t>
+        <w:t xml:space="preserve">These studies fail to indicate how many models were fit until the right one was obtained. In upcoming work we highlight how these methods fail to predict changes in poverty in the Peru. The simulations presented here are useful to illustrate how easy it is for these methods to fail. </w:t>
       </w:r>
     </w:p>
     <w:p/>
@@ -1102,61 +736,19 @@
         <w:rPr>
           <w:color w:val="45B0E1" w:themeColor="accent1" w:themeTint="99"/>
         </w:rPr>
-        <w:t xml:space="preserve">The MSE is estimated </w:t>
-      </w:r>
-      <w:proofErr w:type="gramStart"/>
-      <w:r>
-        <w:rPr>
-          <w:color w:val="45B0E1" w:themeColor="accent1" w:themeTint="99"/>
-        </w:rPr>
-        <w:t>following</w:t>
-      </w:r>
-      <w:proofErr w:type="gramEnd"/>
-      <w:r>
-        <w:rPr>
-          <w:color w:val="45B0E1" w:themeColor="accent1" w:themeTint="99"/>
-        </w:rPr>
-        <w:t xml:space="preserve"> standard statistical </w:t>
-      </w:r>
-      <w:proofErr w:type="gramStart"/>
-      <w:r>
-        <w:rPr>
-          <w:color w:val="45B0E1" w:themeColor="accent1" w:themeTint="99"/>
-        </w:rPr>
-        <w:t>literature</w:t>
-      </w:r>
-      <w:r>
-        <w:rPr>
-          <w:color w:val="45B0E1" w:themeColor="accent1" w:themeTint="99"/>
-        </w:rPr>
-        <w:t>, and</w:t>
-      </w:r>
-      <w:proofErr w:type="gramEnd"/>
-      <w:r>
-        <w:rPr>
-          <w:color w:val="45B0E1" w:themeColor="accent1" w:themeTint="99"/>
-        </w:rPr>
-        <w:t xml:space="preserve"> follows the assumed model</w:t>
-      </w:r>
-      <w:r>
-        <w:rPr>
-          <w:color w:val="45B0E1" w:themeColor="accent1" w:themeTint="99"/>
-        </w:rPr>
-        <w:t xml:space="preserve">. The parametric bootstrap yields an estimate of the MSE. What figure 8 illustrates is </w:t>
-      </w:r>
-      <w:proofErr w:type="gramStart"/>
-      <w:r>
-        <w:rPr>
-          <w:color w:val="45B0E1" w:themeColor="accent1" w:themeTint="99"/>
-        </w:rPr>
-        <w:t>that in reality, the</w:t>
-      </w:r>
-      <w:proofErr w:type="gramEnd"/>
-      <w:r>
-        <w:rPr>
-          <w:color w:val="45B0E1" w:themeColor="accent1" w:themeTint="99"/>
-        </w:rPr>
-        <w:t xml:space="preserve"> typical noise measure used in MI as well as the noise estimated via a parametric bootstrap yield an upward biased estimate of the noise, in this case noted by the empirical MSE.</w:t>
+        <w:t>The MSE is estimated following standard statistical literature</w:t>
+      </w:r>
+      <w:r>
+        <w:rPr>
+          <w:color w:val="45B0E1" w:themeColor="accent1" w:themeTint="99"/>
+        </w:rPr>
+        <w:t>, and follows the assumed model</w:t>
+      </w:r>
+      <w:r>
+        <w:rPr>
+          <w:color w:val="45B0E1" w:themeColor="accent1" w:themeTint="99"/>
+        </w:rPr>
+        <w:t>. The parametric bootstrap yields an estimate of the MSE. What figure 8 illustrates is that in reality, the typical noise measure used in MI as well as the noise estimated via a parametric bootstrap yield an upward biased estimate of the noise, in this case noted by the empirical MSE.</w:t>
       </w:r>
     </w:p>
     <w:p/>
@@ -1225,15 +817,7 @@
     <w:p/>
     <w:p>
       <w:r>
-        <w:t xml:space="preserve">Finally, MI and parametric </w:t>
-      </w:r>
-      <w:proofErr w:type="gramStart"/>
-      <w:r>
-        <w:t>bootstrap</w:t>
-      </w:r>
-      <w:proofErr w:type="gramEnd"/>
-      <w:r>
-        <w:t xml:space="preserve"> inherently differ because MI incorporates the uncertainty of coefficient and variance estimates, whereas the parametric bootstrap treats them as fixed. The latter is appropriate when OLS estimates are consistent and the sample is large, as parameter uncertainty vanishes asymptotically. When sample sizes are limited, however, the parametric bootstrap may underestimate total MSE. Hence, MI-based MSEs are expected to be larger, but this does not imply superiority of one approach over the other. Including a short theoretical discussion on the asymptotic and small-sample properties of MI and the parametric bootstrap would help readers interpret the simulation results more effectively.</w:t>
+        <w:t>Finally, MI and parametric bootstrap inherently differ because MI incorporates the uncertainty of coefficient and variance estimates, whereas the parametric bootstrap treats them as fixed. The latter is appropriate when OLS estimates are consistent and the sample is large, as parameter uncertainty vanishes asymptotically. When sample sizes are limited, however, the parametric bootstrap may underestimate total MSE. Hence, MI-based MSEs are expected to be larger, but this does not imply superiority of one approach over the other. Including a short theoretical discussion on the asymptotic and small-sample properties of MI and the parametric bootstrap would help readers interpret the simulation results more effectively.</w:t>
       </w:r>
     </w:p>
     <w:p>
@@ -1273,47 +857,17 @@
         </w:rPr>
         <w:t xml:space="preserve">. The survey’s betas are taken as the truth and are used to create multiple census data, where across the census data the only thing that varies </w:t>
       </w:r>
-      <w:proofErr w:type="gramStart"/>
-      <w:r>
-        <w:rPr>
-          <w:color w:val="45B0E1" w:themeColor="accent1" w:themeTint="99"/>
-        </w:rPr>
-        <w:t>are</w:t>
-      </w:r>
-      <w:proofErr w:type="gramEnd"/>
-      <w:r>
-        <w:rPr>
-          <w:color w:val="45B0E1" w:themeColor="accent1" w:themeTint="99"/>
-        </w:rPr>
-        <w:t xml:space="preserve"> the simulated errors, but these still come from the </w:t>
-      </w:r>
-      <w:proofErr w:type="spellStart"/>
-      <w:r>
-        <w:rPr>
-          <w:color w:val="45B0E1" w:themeColor="accent1" w:themeTint="99"/>
-        </w:rPr>
-        <w:t>sigmas</w:t>
-      </w:r>
-      <w:proofErr w:type="spellEnd"/>
-      <w:r>
-        <w:rPr>
-          <w:color w:val="45B0E1" w:themeColor="accent1" w:themeTint="99"/>
-        </w:rPr>
-        <w:t xml:space="preserve"> estimated in the survey. </w:t>
-      </w:r>
-      <w:proofErr w:type="gramStart"/>
-      <w:r>
-        <w:rPr>
-          <w:color w:val="45B0E1" w:themeColor="accent1" w:themeTint="99"/>
-        </w:rPr>
-        <w:t>Thus</w:t>
-      </w:r>
-      <w:proofErr w:type="gramEnd"/>
-      <w:r>
-        <w:rPr>
-          <w:color w:val="45B0E1" w:themeColor="accent1" w:themeTint="99"/>
-        </w:rPr>
-        <w:t xml:space="preserve"> across bootstrap replicates, the betas and distribution parameters vary.</w:t>
+      <w:r>
+        <w:rPr>
+          <w:color w:val="45B0E1" w:themeColor="accent1" w:themeTint="99"/>
+        </w:rPr>
+        <w:t xml:space="preserve">are the simulated errors, but these still come from the sigmas estimated in the survey. </w:t>
+      </w:r>
+      <w:r>
+        <w:rPr>
+          <w:color w:val="45B0E1" w:themeColor="accent1" w:themeTint="99"/>
+        </w:rPr>
+        <w:t>Thus across bootstrap replicates, the betas and distribution parameters vary.</w:t>
       </w:r>
     </w:p>
     <w:p>
@@ -1322,63 +876,7 @@
           <w:color w:val="45B0E1" w:themeColor="accent1" w:themeTint="99"/>
         </w:rPr>
         <w:lastRenderedPageBreak/>
-        <w:t xml:space="preserve">Across each of these censuses, the survey sample is </w:t>
-      </w:r>
-      <w:proofErr w:type="gramStart"/>
-      <w:r>
-        <w:rPr>
-          <w:color w:val="45B0E1" w:themeColor="accent1" w:themeTint="99"/>
-        </w:rPr>
-        <w:t>extracted</w:t>
-      </w:r>
-      <w:proofErr w:type="gramEnd"/>
-      <w:r>
-        <w:rPr>
-          <w:color w:val="45B0E1" w:themeColor="accent1" w:themeTint="99"/>
-        </w:rPr>
-        <w:t xml:space="preserve"> and the model is </w:t>
-      </w:r>
-      <w:proofErr w:type="gramStart"/>
-      <w:r>
-        <w:rPr>
-          <w:color w:val="45B0E1" w:themeColor="accent1" w:themeTint="99"/>
-        </w:rPr>
-        <w:t>refit</w:t>
-      </w:r>
-      <w:proofErr w:type="gramEnd"/>
-      <w:r>
-        <w:rPr>
-          <w:color w:val="45B0E1" w:themeColor="accent1" w:themeTint="99"/>
-        </w:rPr>
-        <w:t xml:space="preserve">. This step leads to a variation in the parameters across each of the bootstrap estimates. Thus, the betas and </w:t>
-      </w:r>
-      <w:proofErr w:type="spellStart"/>
-      <w:r>
-        <w:rPr>
-          <w:color w:val="45B0E1" w:themeColor="accent1" w:themeTint="99"/>
-        </w:rPr>
-        <w:t>sigmas</w:t>
-      </w:r>
-      <w:proofErr w:type="spellEnd"/>
-      <w:r>
-        <w:rPr>
-          <w:color w:val="45B0E1" w:themeColor="accent1" w:themeTint="99"/>
-        </w:rPr>
-        <w:t xml:space="preserve"> across replicates vary. What the simulation undertaken in the paper is meant to show is how both methods </w:t>
-      </w:r>
-      <w:proofErr w:type="gramStart"/>
-      <w:r>
-        <w:rPr>
-          <w:color w:val="45B0E1" w:themeColor="accent1" w:themeTint="99"/>
-        </w:rPr>
-        <w:t>actually lead</w:t>
-      </w:r>
-      <w:proofErr w:type="gramEnd"/>
-      <w:r>
-        <w:rPr>
-          <w:color w:val="45B0E1" w:themeColor="accent1" w:themeTint="99"/>
-        </w:rPr>
-        <w:t xml:space="preserve"> to an overestimation of the imputation’s true MSE as approximated by the empirical MSE. We have clarified this further in the text. </w:t>
+        <w:t xml:space="preserve">Across each of these censuses, the survey sample is extracted and the model is refit. This step leads to a variation in the parameters across each of the bootstrap estimates. Thus, the betas and sigmas across replicates vary. What the simulation undertaken in the paper is meant to show is how both methods actually lead to an overestimation of the imputation’s true MSE as approximated by the empirical MSE. We have clarified this further in the text. </w:t>
       </w:r>
     </w:p>
     <w:p>
@@ -1401,21 +899,7 @@
         <w:rPr>
           <w:color w:val="45B0E1" w:themeColor="accent1" w:themeTint="99"/>
         </w:rPr>
-        <w:t xml:space="preserve">This is </w:t>
-      </w:r>
-      <w:proofErr w:type="gramStart"/>
-      <w:r>
-        <w:rPr>
-          <w:color w:val="45B0E1" w:themeColor="accent1" w:themeTint="99"/>
-        </w:rPr>
-        <w:t>accurate, and</w:t>
-      </w:r>
-      <w:proofErr w:type="gramEnd"/>
-      <w:r>
-        <w:rPr>
-          <w:color w:val="45B0E1" w:themeColor="accent1" w:themeTint="99"/>
-        </w:rPr>
-        <w:t xml:space="preserve"> presents another reason as to why applying these methods over time is problematic and can lead to wrong predictions. </w:t>
+        <w:t xml:space="preserve">This is accurate, and presents another reason as to why applying these methods over time is problematic and can lead to wrong predictions. </w:t>
       </w:r>
       <w:r>
         <w:rPr>
@@ -1433,15 +917,7 @@
     <w:p/>
     <w:p>
       <w:r>
-        <w:t xml:space="preserve">Given this uncertainty, relying on empirical distribution might not always be the most robust choice. Since the normal distribution serves as an asymptotic approximation for many residual processes under standard regularity conditions, assuming normality could, in some cases, be a safer and more generalizable option. In other words, while using empirical residuals can improve fit within the same period, its validity across time depends critically on the stability of the error </w:t>
-      </w:r>
-      <w:proofErr w:type="gramStart"/>
-      <w:r>
-        <w:t>distribution—</w:t>
-      </w:r>
-      <w:proofErr w:type="gramEnd"/>
-      <w:r>
-        <w:t>something that cannot be verified when welfare data are unavailable in the target survey. In this sense also, it will be useful to include some empirical assessments on this issue.</w:t>
+        <w:t>Given this uncertainty, relying on empirical distribution might not always be the most robust choice. Since the normal distribution serves as an asymptotic approximation for many residual processes under standard regularity conditions, assuming normality could, in some cases, be a safer and more generalizable option. In other words, while using empirical residuals can improve fit within the same period, its validity across time depends critically on the stability of the error distribution—something that cannot be verified when welfare data are unavailable in the target survey. In this sense also, it will be useful to include some empirical assessments on this issue.</w:t>
       </w:r>
     </w:p>
     <w:p>

</xml_diff>

<commit_message>
updates to the mexico sims
</commit_message>
<xml_diff>
--- a/4.writeup/Reviewers.docx
+++ b/4.writeup/Reviewers.docx
@@ -29,7 +29,23 @@
     </w:p>
     <w:p>
       <w:r>
-        <w:t>This paper  evaluates various strategies to conduct survey-to-survey imputation methods to predict poverty, which have been applied to various data-poor contexts in the developing world. The paper presents the results from extensive simulation exercises under different error distributions, biases sample, and other conditions. The paper offers a number of recommendations to practitioners.</w:t>
+        <w:t xml:space="preserve">This </w:t>
+      </w:r>
+      <w:proofErr w:type="gramStart"/>
+      <w:r>
+        <w:t>paper  evaluates</w:t>
+      </w:r>
+      <w:proofErr w:type="gramEnd"/>
+      <w:r>
+        <w:t xml:space="preserve"> various strategies to conduct survey-to-survey imputation methods to predict poverty, which have been applied to various data-poor contexts in the developing world. The paper presents the results from extensive simulation exercises under different error distributions, biases sample, and other conditions. The paper offers </w:t>
+      </w:r>
+      <w:proofErr w:type="gramStart"/>
+      <w:r>
+        <w:t>a number of</w:t>
+      </w:r>
+      <w:proofErr w:type="gramEnd"/>
+      <w:r>
+        <w:t xml:space="preserve"> recommendations to practitioners.</w:t>
       </w:r>
     </w:p>
     <w:p/>
@@ -40,18 +56,226 @@
     </w:p>
     <w:p>
       <w:r>
-        <w:t>While I appreciate the purpose of the paper, the contribution of the paper is limited at best. There is no theoretical contribution and the practical relevance of the paper is debatable, which I elaborate in the next point.</w:t>
+        <w:t xml:space="preserve">While I appreciate the purpose of the paper, the contribution of the paper is limited at best. There is no theoretical </w:t>
+      </w:r>
+      <w:proofErr w:type="gramStart"/>
+      <w:r>
+        <w:t>contribution</w:t>
+      </w:r>
+      <w:proofErr w:type="gramEnd"/>
+      <w:r>
+        <w:t xml:space="preserve"> and the practical relevance of the paper is debatable, which I </w:t>
+      </w:r>
+      <w:proofErr w:type="gramStart"/>
+      <w:r>
+        <w:t>elaborate</w:t>
+      </w:r>
+      <w:proofErr w:type="gramEnd"/>
+      <w:r>
+        <w:t xml:space="preserve"> </w:t>
+      </w:r>
+      <w:proofErr w:type="gramStart"/>
+      <w:r>
+        <w:t>in</w:t>
+      </w:r>
+      <w:proofErr w:type="gramEnd"/>
+      <w:r>
+        <w:t xml:space="preserve"> the next point.</w:t>
+      </w:r>
+    </w:p>
+    <w:p>
+      <w:r>
+        <w:rPr>
+          <w:color w:val="45B0E1" w:themeColor="accent1" w:themeTint="99"/>
+        </w:rPr>
+        <w:t xml:space="preserve">Thank you. The paper’s contribution is methodological rather than theoretical: it quantifies how specific departures from the core S2S assumptions translate into errors in poverty and inequality estimates and compares common implementation choices. In the revision, we clarify this contribution in the Introduction and strengthen the evidence-to-recommendation link. We also add robustness exercises (an alternative DGP and an empirically grounded design using Mexican </w:t>
+      </w:r>
+      <w:proofErr w:type="spellStart"/>
+      <w:r>
+        <w:rPr>
+          <w:color w:val="45B0E1" w:themeColor="accent1" w:themeTint="99"/>
+        </w:rPr>
+        <w:t>Intercensus</w:t>
+      </w:r>
+      <w:proofErr w:type="spellEnd"/>
+      <w:r>
+        <w:rPr>
+          <w:color w:val="45B0E1" w:themeColor="accent1" w:themeTint="99"/>
+        </w:rPr>
+        <w:t xml:space="preserve"> covariate structure under nested, heteroskedastic, and heavy-tailed errors) to address </w:t>
+      </w:r>
+      <w:r>
+        <w:rPr>
+          <w:color w:val="45B0E1" w:themeColor="accent1" w:themeTint="99"/>
+        </w:rPr>
+        <w:t>alternate choices of DGP</w:t>
+      </w:r>
+      <w:r>
+        <w:rPr>
+          <w:color w:val="45B0E1" w:themeColor="accent1" w:themeTint="99"/>
+        </w:rPr>
+        <w:t xml:space="preserve">, and we introduce </w:t>
+      </w:r>
+      <w:r>
+        <w:rPr>
+          <w:color w:val="45B0E1" w:themeColor="accent1" w:themeTint="99"/>
+        </w:rPr>
+        <w:t>the issue of</w:t>
+      </w:r>
+      <w:r>
+        <w:rPr>
+          <w:color w:val="45B0E1" w:themeColor="accent1" w:themeTint="99"/>
+        </w:rPr>
+        <w:t xml:space="preserve"> omitted-variable-bias channel—particularly relevant when </w:t>
+      </w:r>
+      <w:r>
+        <w:rPr>
+          <w:color w:val="45B0E1" w:themeColor="accent1" w:themeTint="99"/>
+        </w:rPr>
+        <w:t>imputing over time in the presence of</w:t>
+      </w:r>
+      <w:r>
+        <w:rPr>
+          <w:color w:val="45B0E1" w:themeColor="accent1" w:themeTint="99"/>
+        </w:rPr>
+        <w:t xml:space="preserve"> shocks—that has not, to our knowledge, been treated explicitly in the S2S literature.</w:t>
+      </w:r>
+    </w:p>
+    <w:p>
+      <w:r>
+        <w:t>Essential Points</w:t>
+      </w:r>
+    </w:p>
+    <w:p>
+      <w:r>
+        <w:t>My biggest concern is the relevance of the DGP chosen. It is unclear to me how the authors came up with eq (6). As the choice of the DGP would affect the results, there should be some discussion on the justification of this choice.</w:t>
+      </w:r>
+    </w:p>
+    <w:p>
+      <w:r>
+        <w:rPr>
+          <w:color w:val="45B0E1" w:themeColor="accent1" w:themeTint="99"/>
+        </w:rPr>
+        <w:t xml:space="preserve">Thank you. The revised manuscript addresses this concern in two ways. First, the baseline DGP underlying equation (6) is now explicitly motivated as a stylized welfare process designed to reflect common features of consumption models used in practice (a mix of discrete and continuous predictors and realistic signal-to-noise), and the manuscript now clarifies the rationale for the chosen parameterization and target moments. Second, to reduce reliance on any single DGP, we add two complementary robustness exercises. (i) We introduce an alternative DGP that generates an </w:t>
+      </w:r>
+      <m:oMath>
+        <m:r>
+          <w:rPr>
+            <w:rFonts w:ascii="Cambria Math" w:hAnsi="Cambria Math"/>
+            <w:color w:val="45B0E1" w:themeColor="accent1" w:themeTint="99"/>
+          </w:rPr>
+          <m:t>Xβ</m:t>
+        </m:r>
+      </m:oMath>
+      <w:r>
+        <w:rPr>
+          <w:color w:val="45B0E1" w:themeColor="accent1" w:themeTint="99"/>
+        </w:rPr>
+        <w:t xml:space="preserve">component that departs more sharply from normality, providing a stricter stress test of distributional assumptions. (ii) We add an empirically grounded design using the Mexican Intercensus Survey (INEGI 2015) as processed in Corral et al. (2021), where we estimate the linear component </w:t>
+      </w:r>
+      <m:oMath>
+        <m:r>
+          <w:rPr>
+            <w:rFonts w:ascii="Cambria Math" w:hAnsi="Cambria Math"/>
+            <w:color w:val="45B0E1" w:themeColor="accent1" w:themeTint="99"/>
+          </w:rPr>
+          <m:t>X</m:t>
+        </m:r>
+        <m:acc>
+          <m:accPr>
+            <m:ctrlPr>
+              <w:rPr>
+                <w:rFonts w:ascii="Cambria Math" w:hAnsi="Cambria Math"/>
+                <w:color w:val="45B0E1" w:themeColor="accent1" w:themeTint="99"/>
+              </w:rPr>
+            </m:ctrlPr>
+          </m:accPr>
+          <m:e>
+            <m:r>
+              <w:rPr>
+                <w:rFonts w:ascii="Cambria Math" w:hAnsi="Cambria Math"/>
+                <w:color w:val="45B0E1" w:themeColor="accent1" w:themeTint="99"/>
+              </w:rPr>
+              <m:t>β</m:t>
+            </m:r>
+          </m:e>
+        </m:acc>
+      </m:oMath>
+      <w:r>
+        <w:rPr>
+          <w:color w:val="45B0E1" w:themeColor="accent1" w:themeTint="99"/>
+        </w:rPr>
+        <w:t xml:space="preserve">on real covariate structure and then generate welfare by adding disturbances with </w:t>
+      </w:r>
+      <w:r>
+        <w:rPr>
+          <w:color w:val="45B0E1" w:themeColor="accent1" w:themeTint="99"/>
+        </w:rPr>
+        <w:lastRenderedPageBreak/>
+        <w:t xml:space="preserve">different properties—nested normal errors, heteroskedastic errors, and heavy-tailed non-normal errors (Student’s </w:t>
+      </w:r>
+      <m:oMath>
+        <m:r>
+          <w:rPr>
+            <w:rFonts w:ascii="Cambria Math" w:hAnsi="Cambria Math"/>
+            <w:color w:val="45B0E1" w:themeColor="accent1" w:themeTint="99"/>
+          </w:rPr>
+          <m:t>t</m:t>
+        </m:r>
+      </m:oMath>
+      <w:r>
+        <w:rPr>
+          <w:color w:val="45B0E1" w:themeColor="accent1" w:themeTint="99"/>
+        </w:rPr>
+        <w:t>). These additions are not intended to be exhaustive or to claim universal external validity across all country contexts; rather, they are included to demonstrate that the qualitative rankings and main conclusions are not an artifact of a single stylized DGP, and to anchor the stress tests in a covariate distribution and sampling structure observed in large-scale household data.</w:t>
+      </w:r>
+    </w:p>
+    <w:p>
+      <w:r>
+        <w:t xml:space="preserve">Even if the DGP is justifiable, it is also unclear to what extent the performance ranking based on this </w:t>
+      </w:r>
+      <w:proofErr w:type="gramStart"/>
+      <w:r>
+        <w:t>particular DGP</w:t>
+      </w:r>
+      <w:proofErr w:type="gramEnd"/>
+      <w:r>
+        <w:t xml:space="preserve"> is applicable to a wide range of contexts where survey-to-survey imputation is used. While the conclusions the authors draw in this paper are not unreasonable, the logical connection between the simulation results and the conclusions in Section 5 is weak.</w:t>
+      </w:r>
+    </w:p>
+    <w:p>
+      <w:pPr>
+        <w:rPr>
+          <w:color w:val="45B0E1" w:themeColor="accent1" w:themeTint="99"/>
+        </w:rPr>
+      </w:pPr>
+      <w:r>
+        <w:rPr>
+          <w:color w:val="45B0E1" w:themeColor="accent1" w:themeTint="99"/>
+        </w:rPr>
+        <w:t>Thank you, we will adjust the conclusions.</w:t>
       </w:r>
     </w:p>
     <w:p/>
     <w:p>
       <w:r>
-        <w:t>Essential Points</w:t>
-      </w:r>
-    </w:p>
-    <w:p>
-      <w:r>
-        <w:t>My biggest concern is the relevance of the DGP chosen. It is unclear to me how the authors came up with eq (6). As the choice of the DGP would affect the results, there should be some discussion on the justification of this choice.</w:t>
+        <w:t xml:space="preserve">Relatedly, it appears to me </w:t>
+      </w:r>
+      <w:proofErr w:type="gramStart"/>
+      <w:r>
+        <w:t>all of</w:t>
+      </w:r>
+      <w:proofErr w:type="gramEnd"/>
+      <w:r>
+        <w:t xml:space="preserve"> the seven recommendations in Section 5 are generic and can be derived without the extensive simulations conducted in the paper. The paper would be much more valuable if the simulations </w:t>
+      </w:r>
+      <w:proofErr w:type="gramStart"/>
+      <w:r>
+        <w:t>are</w:t>
+      </w:r>
+      <w:proofErr w:type="gramEnd"/>
+      <w:r>
+        <w:t xml:space="preserve"> done in a more realistic context and identify a set of particularly important pitfalls.</w:t>
       </w:r>
     </w:p>
     <w:p>
@@ -64,13 +288,35 @@
         <w:rPr>
           <w:color w:val="45B0E1" w:themeColor="accent1" w:themeTint="99"/>
         </w:rPr>
-        <w:t>Thanks. In line with other comments we’ve modified the DGP so we can add results from a different DGP. We’ve also added some results based on real world data. We’ve taken the Mexican intercensus survey as detailed in Corral et al. (2021) and applied different errors (normal, non normal, heteroskedastic) to the linear portion of the model to further emphasize some of the results. We understand that these additions are not exhaustive, and will clarify as such in the document, but they do lend further credence to the findings.</w:t>
+        <w:t xml:space="preserve">Thank you. We have added real world data simulations to the paper. Despite the simplicity of the simulations illustrated, we feel that illustrating how under the model’s underlying assumptions these predictions may easily fail raises considerable questions on the method’s validity as applied in some scenarios. When applied to real world data and bringing in an additional component of changes across time, there are many things that are changing and could lead to the identified biases cancelling out or even compounding. Given the fact that these methods are applied when the true point estimates are unavailable, it is impossible for people to know if the biases have </w:t>
+      </w:r>
+      <w:proofErr w:type="gramStart"/>
+      <w:r>
+        <w:rPr>
+          <w:color w:val="45B0E1" w:themeColor="accent1" w:themeTint="99"/>
+        </w:rPr>
+        <w:t>cancelled out</w:t>
+      </w:r>
+      <w:proofErr w:type="gramEnd"/>
+      <w:r>
+        <w:rPr>
+          <w:color w:val="45B0E1" w:themeColor="accent1" w:themeTint="99"/>
+        </w:rPr>
+        <w:t xml:space="preserve"> or compounded. Thus, we feel it is important for practitioners to understand and recognize the potential failings of the method.</w:t>
       </w:r>
     </w:p>
     <w:p/>
     <w:p>
       <w:r>
-        <w:t>Even if the DGP is justifiable, it is also unclear to what extent the performance ranking based on this particular DGP is applicable to a wide range of contexts where survey-to-survey imputation is used. While the conclusions the authors draw in this paper are not unreasonable, the logical connection between the simulation results and the conclusions in Section 5 is weak.</w:t>
+        <w:t xml:space="preserve">I also have several other reservations. First, this paper almost exclusively </w:t>
+      </w:r>
+      <w:proofErr w:type="gramStart"/>
+      <w:r>
+        <w:t>focus</w:t>
+      </w:r>
+      <w:proofErr w:type="gramEnd"/>
+      <w:r>
+        <w:t xml:space="preserve"> on bias. However, I would argue that MSE is at least as important as bias. An unbiased but very noisy estimator is arguably not as good as precise but slightly biased estimator.  </w:t>
       </w:r>
     </w:p>
     <w:p>
@@ -83,17 +329,138 @@
         <w:rPr>
           <w:color w:val="45B0E1" w:themeColor="accent1" w:themeTint="99"/>
         </w:rPr>
-        <w:t>Thank you, we will adjust the conclusions.</w:t>
+        <w:t xml:space="preserve">Thank you. </w:t>
+      </w:r>
+      <w:r>
+        <w:rPr>
+          <w:color w:val="45B0E1" w:themeColor="accent1" w:themeTint="99"/>
+        </w:rPr>
+        <w:t xml:space="preserve">We have added </w:t>
+      </w:r>
+      <w:r>
+        <w:rPr>
+          <w:color w:val="45B0E1" w:themeColor="accent1" w:themeTint="99"/>
+        </w:rPr>
+        <w:t xml:space="preserve">empirical </w:t>
+      </w:r>
+      <w:r>
+        <w:rPr>
+          <w:color w:val="45B0E1" w:themeColor="accent1" w:themeTint="99"/>
+        </w:rPr>
+        <w:t>MSE</w:t>
+      </w:r>
+      <w:r>
+        <w:rPr>
+          <w:color w:val="45B0E1" w:themeColor="accent1" w:themeTint="99"/>
+        </w:rPr>
+        <w:t xml:space="preserve"> values</w:t>
+      </w:r>
+      <w:r>
+        <w:rPr>
+          <w:color w:val="45B0E1" w:themeColor="accent1" w:themeTint="99"/>
+        </w:rPr>
+        <w:t>.</w:t>
       </w:r>
     </w:p>
     <w:p/>
     <w:p>
       <w:r>
-        <w:t xml:space="preserve">Relatedly, it appears to me all of the seven recommendations in Section 5 are generic and can be derived without the extensive simulations conducted in the paper. The paper would be much more </w:t>
-      </w:r>
-      <w:r>
+        <w:t>Second, all the mathematical notations should be clearly defined and used coherently. For example, \bar{x} is not defined (PDF p.12/45, around l.12). I don’t know if this is the same as \bar{X} (around l.56 of the same page), which is also not adequately defined.</w:t>
+      </w:r>
+    </w:p>
+    <w:p>
+      <w:pPr>
+        <w:rPr>
+          <w:color w:val="45B0E1" w:themeColor="accent1" w:themeTint="99"/>
+        </w:rPr>
+      </w:pPr>
+      <w:r>
+        <w:rPr>
+          <w:color w:val="45B0E1" w:themeColor="accent1" w:themeTint="99"/>
+        </w:rPr>
+        <w:t xml:space="preserve">Thank you, we </w:t>
+      </w:r>
+      <w:r>
+        <w:rPr>
+          <w:color w:val="45B0E1" w:themeColor="accent1" w:themeTint="99"/>
+        </w:rPr>
+        <w:t xml:space="preserve">have fixed </w:t>
+      </w:r>
+      <w:proofErr w:type="gramStart"/>
+      <w:r>
+        <w:rPr>
+          <w:color w:val="45B0E1" w:themeColor="accent1" w:themeTint="99"/>
+        </w:rPr>
+        <w:t>these</w:t>
+      </w:r>
+      <w:r>
+        <w:rPr>
+          <w:color w:val="45B0E1" w:themeColor="accent1" w:themeTint="99"/>
+        </w:rPr>
+        <w:t xml:space="preserve"> </w:t>
+      </w:r>
+      <w:proofErr w:type="spellStart"/>
+      <w:r>
+        <w:rPr>
+          <w:color w:val="45B0E1" w:themeColor="accent1" w:themeTint="99"/>
+        </w:rPr>
+        <w:t>these</w:t>
+      </w:r>
+      <w:proofErr w:type="spellEnd"/>
+      <w:proofErr w:type="gramEnd"/>
+      <w:r>
+        <w:rPr>
+          <w:color w:val="45B0E1" w:themeColor="accent1" w:themeTint="99"/>
+        </w:rPr>
+        <w:t>.</w:t>
+      </w:r>
+    </w:p>
+    <w:p/>
+    <w:p>
+      <w:r>
+        <w:t xml:space="preserve">Also, the interpretation of </w:t>
+      </w:r>
+      <w:proofErr w:type="gramStart"/>
+      <w:r>
+        <w:t>eq.(</w:t>
+      </w:r>
+      <w:proofErr w:type="gramEnd"/>
+      <w:r>
+        <w:t>5) does not seem correct. How could the population parameter be determined by parameter estimates? Also, \bar{X}_{target} looks like the sample mean but this ought to be the population mean if the LHS is supposed to be the population parameter.</w:t>
+      </w:r>
+    </w:p>
+    <w:p>
+      <w:pPr>
+        <w:rPr>
+          <w:color w:val="45B0E1" w:themeColor="accent1" w:themeTint="99"/>
+        </w:rPr>
+      </w:pPr>
+      <w:r>
+        <w:rPr>
+          <w:color w:val="45B0E1" w:themeColor="accent1" w:themeTint="99"/>
+        </w:rPr>
         <w:lastRenderedPageBreak/>
-        <w:t>valuable if the simulations are done in a more realistic context and identify a set of particularly important pitfalls.</w:t>
+        <w:t>We have removed this section.</w:t>
+      </w:r>
+      <w:r>
+        <w:rPr>
+          <w:color w:val="45B0E1" w:themeColor="accent1" w:themeTint="99"/>
+        </w:rPr>
+        <w:t xml:space="preserve"> We felt we can make our point without it.</w:t>
+      </w:r>
+    </w:p>
+    <w:p/>
+    <w:p>
+      <w:r>
+        <w:t xml:space="preserve">Third, the sampling is quite problematic to me. If I understand correctly, both the source and target are 20 percent simple random </w:t>
+      </w:r>
+      <w:proofErr w:type="gramStart"/>
+      <w:r>
+        <w:t>sample</w:t>
+      </w:r>
+      <w:proofErr w:type="gramEnd"/>
+      <w:r>
+        <w:t xml:space="preserve"> of the data. This means that 20 percent of the source survey appears in the target survey and vice versa. This is highly unrealistic. In a practical setting, there is no overlap.</w:t>
       </w:r>
     </w:p>
     <w:p>
@@ -106,13 +473,48 @@
         <w:rPr>
           <w:color w:val="45B0E1" w:themeColor="accent1" w:themeTint="99"/>
         </w:rPr>
-        <w:t>Thank you. We have added real world data simulations to the paper. Despite the simplicity of the simulations illustrated, we feel that illustrating how under the model’s underlying assumptions these predictions may easily fail raises considerable questions on the method’s validity as applied in some scenarios. When applied to real world data and bringing in an additional component of changes across time, there are many things that are changing and could lead to the identified biases cancelling out or even compounding. Given the fact that these methods are applied when the true point estimates are unavailable, it is impossible for people to know if the biases have cancelled out or compounded. Thus, we feel it is important for practitioners to understand and recognize the potential failings of the method.</w:t>
+        <w:t xml:space="preserve">Thank you. We agree. We have added simulations with real world data that better illustrate the problems. </w:t>
       </w:r>
     </w:p>
     <w:p/>
     <w:p>
       <w:r>
-        <w:t xml:space="preserve">I also have several other reservations. First, this paper almost exclusively focus on bias. However, I would argue that MSE is at least as important as bias. An unbiased but very noisy estimator is arguably not as good as precise but slightly biased estimator.  </w:t>
+        <w:t>Finally, a very minor point.  + is repeated in Eq (10) before \</w:t>
+      </w:r>
+      <w:proofErr w:type="spellStart"/>
+      <w:r>
+        <w:t>eta_a</w:t>
+      </w:r>
+      <w:proofErr w:type="spellEnd"/>
+      <w:r>
+        <w:t>.</w:t>
+      </w:r>
+    </w:p>
+    <w:p/>
+    <w:p>
+      <w:r>
+        <w:t>Suggestions</w:t>
+      </w:r>
+    </w:p>
+    <w:p>
+      <w:r>
+        <w:t xml:space="preserve">I suggest that the authors choose a realistic DGP in a particular country that ideally has at least two rounds of survey. Pick a parsimonious consumption model with five or so covariates (as with the current model). Ideally, these covariates are often chosen in consumption models elsewhere and mix </w:t>
+      </w:r>
+      <w:proofErr w:type="gramStart"/>
+      <w:r>
+        <w:t>discrete</w:t>
+      </w:r>
+      <w:proofErr w:type="gramEnd"/>
+      <w:r>
+        <w:t xml:space="preserve"> and continuous variables. Then, calibrate the DGP to mimic the empirical distribution of both covariates and outcomes. By doing this for two rounds, it would be possible to shed some light on some of the recommendations in the conclusion. Population and sample sizes should be calibrated at realistic levels (in the current setup, the sample size is ok, but the population size is way too small). In this way, the authors can still fully control data generation, but the results have at least some </w:t>
+      </w:r>
+      <w:proofErr w:type="gramStart"/>
+      <w:r>
+        <w:t>resemblance</w:t>
+      </w:r>
+      <w:proofErr w:type="gramEnd"/>
+      <w:r>
+        <w:t xml:space="preserve"> to the country that they chose.</w:t>
       </w:r>
     </w:p>
     <w:p>
@@ -125,186 +527,79 @@
         <w:rPr>
           <w:color w:val="45B0E1" w:themeColor="accent1" w:themeTint="99"/>
         </w:rPr>
-        <w:t xml:space="preserve">Thank you. </w:t>
-      </w:r>
-      <w:r>
-        <w:rPr>
-          <w:color w:val="45B0E1" w:themeColor="accent1" w:themeTint="99"/>
-        </w:rPr>
-        <w:t xml:space="preserve">We have added </w:t>
-      </w:r>
-      <w:r>
-        <w:rPr>
-          <w:color w:val="45B0E1" w:themeColor="accent1" w:themeTint="99"/>
-        </w:rPr>
-        <w:t xml:space="preserve">empirical </w:t>
-      </w:r>
-      <w:r>
-        <w:rPr>
-          <w:color w:val="45B0E1" w:themeColor="accent1" w:themeTint="99"/>
-        </w:rPr>
-        <w:t>MSE</w:t>
-      </w:r>
-      <w:r>
-        <w:rPr>
-          <w:color w:val="45B0E1" w:themeColor="accent1" w:themeTint="99"/>
-        </w:rPr>
-        <w:t xml:space="preserve"> values</w:t>
-      </w:r>
-      <w:r>
-        <w:rPr>
-          <w:color w:val="45B0E1" w:themeColor="accent1" w:themeTint="99"/>
-        </w:rPr>
-        <w:t>.</w:t>
+        <w:t>Thank you, we have now tweaked the recommendation. We added simulations with a different DGP, but more importantly added simulations with real world data</w:t>
+      </w:r>
+      <w:r>
+        <w:rPr>
+          <w:color w:val="45B0E1" w:themeColor="accent1" w:themeTint="99"/>
+        </w:rPr>
+        <w:t>. We’ve used Mexican data as presented in Corral et al (2021) and Corral, Henderson and Segovia (2025) to run our simulations.</w:t>
+      </w:r>
+      <w:r>
+        <w:rPr>
+          <w:color w:val="45B0E1" w:themeColor="accent1" w:themeTint="99"/>
+        </w:rPr>
+        <w:t xml:space="preserve"> The advantage of this is that the </w:t>
+      </w:r>
+      <w:proofErr w:type="spellStart"/>
+      <w:r>
+        <w:rPr>
+          <w:color w:val="45B0E1" w:themeColor="accent1" w:themeTint="99"/>
+        </w:rPr>
+        <w:t>intracensal</w:t>
+      </w:r>
+      <w:proofErr w:type="spellEnd"/>
+      <w:r>
+        <w:rPr>
+          <w:color w:val="45B0E1" w:themeColor="accent1" w:themeTint="99"/>
+        </w:rPr>
+        <w:t xml:space="preserve"> survey is treated as a census of roughly 3.9 million households, from which we draw over 500 samples. One of these samples is randomly chosen to fit the model. The model is then fit to the remaining 500 samples to obtain bias and noise estimates.</w:t>
+      </w:r>
+    </w:p>
+    <w:p>
+      <w:r>
+        <w:rPr>
+          <w:color w:val="45B0E1" w:themeColor="accent1" w:themeTint="99"/>
+        </w:rPr>
+        <w:t>Regarding the reviewer’s recommendation for testing with two rounds, we (the same author team) have a separate paper which delves more into the issues of imputation over time using Peruvian data.</w:t>
+      </w:r>
+    </w:p>
+    <w:p>
+      <w:r>
+        <w:t>In the current simulation, all the covariates are independent of each other. This would be a natural starting point, but I would encourage the authors to consider allowing for some correlations between covariates. If two variables are highly correlated, omission of one of the two may not be as serious as the omission of some other covariates.</w:t>
+      </w:r>
+    </w:p>
+    <w:p>
+      <w:pPr>
+        <w:rPr>
+          <w:color w:val="45B0E1" w:themeColor="accent1" w:themeTint="99"/>
+        </w:rPr>
+      </w:pPr>
+      <w:r>
+        <w:rPr>
+          <w:color w:val="45B0E1" w:themeColor="accent1" w:themeTint="99"/>
+        </w:rPr>
+        <w:t xml:space="preserve">Thanks, </w:t>
+      </w:r>
+      <w:proofErr w:type="gramStart"/>
+      <w:r>
+        <w:rPr>
+          <w:color w:val="45B0E1" w:themeColor="accent1" w:themeTint="99"/>
+        </w:rPr>
+        <w:t>in</w:t>
+      </w:r>
+      <w:proofErr w:type="gramEnd"/>
+      <w:r>
+        <w:rPr>
+          <w:color w:val="45B0E1" w:themeColor="accent1" w:themeTint="99"/>
+        </w:rPr>
+        <w:t xml:space="preserve"> the current simulations we have 2 covariates that are correlated. In the Mexican data, correlations are also present.</w:t>
       </w:r>
     </w:p>
     <w:p/>
     <w:p>
       <w:r>
-        <w:t>Second, all the mathematical notations should be clearly defined and used coherently. For example, \bar{x} is not defined (PDF p.12/45, around l.12). I don’t know if this is the same as \bar{X} (around l.56 of the same page), which is also not adequately defined.</w:t>
-      </w:r>
-    </w:p>
-    <w:p>
-      <w:pPr>
-        <w:rPr>
-          <w:color w:val="45B0E1" w:themeColor="accent1" w:themeTint="99"/>
-        </w:rPr>
-      </w:pPr>
-      <w:r>
-        <w:rPr>
-          <w:color w:val="45B0E1" w:themeColor="accent1" w:themeTint="99"/>
-        </w:rPr>
-        <w:t xml:space="preserve">Thank you, we </w:t>
-      </w:r>
-      <w:r>
-        <w:rPr>
-          <w:color w:val="45B0E1" w:themeColor="accent1" w:themeTint="99"/>
-        </w:rPr>
-        <w:t>have fixed these</w:t>
-      </w:r>
-      <w:r>
-        <w:rPr>
-          <w:color w:val="45B0E1" w:themeColor="accent1" w:themeTint="99"/>
-        </w:rPr>
-        <w:t xml:space="preserve"> these.</w:t>
-      </w:r>
-    </w:p>
-    <w:p/>
-    <w:p>
-      <w:r>
-        <w:t>Also, the interpretation of eq.(5) does not seem correct. How could the population parameter be determined by parameter estimates? Also, \bar{X}_{target} looks like the sample mean but this ought to be the population mean if the LHS is supposed to be the population parameter.</w:t>
-      </w:r>
-    </w:p>
-    <w:p>
-      <w:pPr>
-        <w:rPr>
-          <w:color w:val="45B0E1" w:themeColor="accent1" w:themeTint="99"/>
-        </w:rPr>
-      </w:pPr>
-      <w:r>
-        <w:rPr>
-          <w:color w:val="45B0E1" w:themeColor="accent1" w:themeTint="99"/>
-        </w:rPr>
-        <w:t>We have removed this section.</w:t>
-      </w:r>
-      <w:r>
-        <w:rPr>
-          <w:color w:val="45B0E1" w:themeColor="accent1" w:themeTint="99"/>
-        </w:rPr>
-        <w:t xml:space="preserve"> We felt we can make our point without it.</w:t>
-      </w:r>
-    </w:p>
-    <w:p/>
-    <w:p>
-      <w:r>
-        <w:t>Third, the sampling is quite problematic to me. If I understand correctly, both the source and target are 20 percent simple random sample of the data. This means that 20 percent of the source survey appears in the target survey and vice versa. This is highly unrealistic. In a practical setting, there is no overlap.</w:t>
-      </w:r>
-    </w:p>
-    <w:p>
-      <w:pPr>
-        <w:rPr>
-          <w:color w:val="45B0E1" w:themeColor="accent1" w:themeTint="99"/>
-        </w:rPr>
-      </w:pPr>
-      <w:r>
-        <w:rPr>
-          <w:color w:val="45B0E1" w:themeColor="accent1" w:themeTint="99"/>
-        </w:rPr>
-        <w:t xml:space="preserve">Thank you. We agree. We have added simulations with real world data that better illustrate the problems. </w:t>
-      </w:r>
-    </w:p>
-    <w:p/>
-    <w:p>
-      <w:r>
-        <w:t>Finally, a very minor point.  + is repeated in Eq (10) before \eta_a.</w:t>
-      </w:r>
-    </w:p>
-    <w:p/>
-    <w:p>
-      <w:r>
-        <w:t>Suggestions</w:t>
-      </w:r>
-    </w:p>
-    <w:p>
-      <w:r>
         <w:lastRenderedPageBreak/>
-        <w:t>I suggest that the authors choose a realistic DGP in a particular country that ideally has at least two rounds of survey. Pick a parsimonious consumption model with five or so covariates (as with the current model). Ideally, these covariates are often chosen in consumption models elsewhere and mix discrete and continuous variables. Then, calibrate the DGP to mimic the empirical distribution of both covariates and outcomes. By doing this for two rounds, it would be possible to shed some light on some of the recommendations in the conclusion. Population and sample sizes should be calibrated at realistic levels (in the current setup, the sample size is ok, but the population size is way too small). In this way, the authors can still fully control data generation, but the results have at least some resemblance to the country that they chose.</w:t>
-      </w:r>
-    </w:p>
-    <w:p>
-      <w:pPr>
-        <w:rPr>
-          <w:color w:val="45B0E1" w:themeColor="accent1" w:themeTint="99"/>
-        </w:rPr>
-      </w:pPr>
-      <w:r>
-        <w:rPr>
-          <w:color w:val="45B0E1" w:themeColor="accent1" w:themeTint="99"/>
-        </w:rPr>
-        <w:t>Thank you, we have now tweaked the recommendation. We added simulations with a different DGP, but more importantly added simulations with real world data</w:t>
-      </w:r>
-      <w:r>
-        <w:rPr>
-          <w:color w:val="45B0E1" w:themeColor="accent1" w:themeTint="99"/>
-        </w:rPr>
-        <w:t>. We’ve used Mexican data as presented in Corral et al (2021) and Corral, Henderson and Segovia (2025) to run our simulations.</w:t>
-      </w:r>
-      <w:r>
-        <w:rPr>
-          <w:color w:val="45B0E1" w:themeColor="accent1" w:themeTint="99"/>
-        </w:rPr>
-        <w:t xml:space="preserve"> The advantage of this is that the intracensal survey is treated as a census of roughly 3.9 million households, from which we draw over 500 samples. One of these samples is randomly chosen to fit the model. The model is then fit to the remaining 500 samples to obtain bias and noise estimates.</w:t>
-      </w:r>
-    </w:p>
-    <w:p>
-      <w:r>
-        <w:rPr>
-          <w:color w:val="45B0E1" w:themeColor="accent1" w:themeTint="99"/>
-        </w:rPr>
-        <w:t>Regarding the reviewer’s recommendation for testing with two rounds, we (the same author team) have a separate paper which delves more into the issues of imputation over time using Peruvian data.</w:t>
-      </w:r>
-    </w:p>
-    <w:p>
-      <w:r>
-        <w:t>In the current simulation, all the covariates are independent of each other. This would be a natural starting point, but I would encourage the authors to consider allowing for some correlations between covariates. If two variables are highly correlated, omission of one of the two may not be as serious as the omission of some other covariates.</w:t>
-      </w:r>
-    </w:p>
-    <w:p>
-      <w:pPr>
-        <w:rPr>
-          <w:color w:val="45B0E1" w:themeColor="accent1" w:themeTint="99"/>
-        </w:rPr>
-      </w:pPr>
-      <w:r>
-        <w:rPr>
-          <w:color w:val="45B0E1" w:themeColor="accent1" w:themeTint="99"/>
-        </w:rPr>
-        <w:t>Thanks, in the current simulations we have 2 covariates that are correlated. In the Mexican data, correlations are also present.</w:t>
-      </w:r>
-    </w:p>
-    <w:p/>
-    <w:p>
-      <w:r>
         <w:t xml:space="preserve">Finally, to highlight the contribution of the paper, the recommendations in </w:t>
       </w:r>
       <w:bookmarkStart w:id="0" w:name="_Hlk217376629"/>
@@ -382,9 +677,22 @@
       <w:r>
         <w:t xml:space="preserve">For example, the simulation in Section 4.5.3—where the inclusion of egg consumption introduces bias in poverty estimates—raises the question of how common such scenarios are. In this setup, a </w:t>
       </w:r>
+      <w:proofErr w:type="gramStart"/>
       <w:r>
         <w:lastRenderedPageBreak/>
-        <w:t>positive shock improves household welfare (mean log expenditure, ln y, rises from 3.98 to 4.03 as the mean shock declines from 0.4 to 0.2), yet the share of households consuming eggs falls from 0.30 to 0.28. Consequently, the model predicts a higher poverty rate despite an actual improvement in welfare.</w:t>
+        <w:t>positive</w:t>
+      </w:r>
+      <w:proofErr w:type="gramEnd"/>
+      <w:r>
+        <w:t xml:space="preserve"> shock improves household welfare (</w:t>
+      </w:r>
+      <w:proofErr w:type="gramStart"/>
+      <w:r>
+        <w:t>mean</w:t>
+      </w:r>
+      <w:proofErr w:type="gramEnd"/>
+      <w:r>
+        <w:t xml:space="preserve"> log expenditure, ln y, rises from 3.98 to 4.03 as the mean shock declines from 0.4 to 0.2), yet the share of households consuming eggs falls from 0.30 to 0.28. Consequently, the model predicts a higher poverty rate despite an actual improvement in welfare.</w:t>
       </w:r>
     </w:p>
     <w:p>
@@ -420,7 +728,42 @@
         <w:rPr>
           <w:color w:val="45B0E1" w:themeColor="accent1" w:themeTint="99"/>
         </w:rPr>
-        <w:t>We are indicating how eggs is affected by the omission of conflict. This is similar to Wooldridge’s (2010 p</w:t>
+        <w:t xml:space="preserve">We are indicating how eggs </w:t>
+      </w:r>
+      <w:proofErr w:type="gramStart"/>
+      <w:r>
+        <w:rPr>
+          <w:color w:val="45B0E1" w:themeColor="accent1" w:themeTint="99"/>
+        </w:rPr>
+        <w:t>is</w:t>
+      </w:r>
+      <w:proofErr w:type="gramEnd"/>
+      <w:r>
+        <w:rPr>
+          <w:color w:val="45B0E1" w:themeColor="accent1" w:themeTint="99"/>
+        </w:rPr>
+        <w:t xml:space="preserve"> affected by the omission of conflict. This is </w:t>
+      </w:r>
+      <w:proofErr w:type="gramStart"/>
+      <w:r>
+        <w:rPr>
+          <w:color w:val="45B0E1" w:themeColor="accent1" w:themeTint="99"/>
+        </w:rPr>
+        <w:t>similar to</w:t>
+      </w:r>
+      <w:proofErr w:type="gramEnd"/>
+      <w:r>
+        <w:rPr>
+          <w:color w:val="45B0E1" w:themeColor="accent1" w:themeTint="99"/>
+        </w:rPr>
+        <w:t xml:space="preserve"> Wooldridge’s (2010 </w:t>
+      </w:r>
+      <w:proofErr w:type="spellStart"/>
+      <w:r>
+        <w:rPr>
+          <w:color w:val="45B0E1" w:themeColor="accent1" w:themeTint="99"/>
+        </w:rPr>
+        <w:t>p</w:t>
       </w:r>
       <w:r>
         <w:rPr>
@@ -428,17 +771,60 @@
         </w:rPr>
         <w:t>XX</w:t>
       </w:r>
-      <w:r>
-        <w:rPr>
-          <w:color w:val="45B0E1" w:themeColor="accent1" w:themeTint="99"/>
-        </w:rPr>
-        <w:t>) example on how omitting ability from the regression impacts the coefficient for education. In our example, eggs is in place of education and conflict is akin to ability.</w:t>
-      </w:r>
-      <w:r>
-        <w:rPr>
-          <w:color w:val="45B0E1" w:themeColor="accent1" w:themeTint="99"/>
-        </w:rPr>
-        <w:t xml:space="preserve"> A valid proxy for conflict would be battle deaths in a given proximity to the household.</w:t>
+      <w:proofErr w:type="spellEnd"/>
+      <w:r>
+        <w:rPr>
+          <w:color w:val="45B0E1" w:themeColor="accent1" w:themeTint="99"/>
+        </w:rPr>
+        <w:t xml:space="preserve">) example on how omitting ability from the regression impacts the coefficient for education. In our example, eggs </w:t>
+      </w:r>
+      <w:proofErr w:type="gramStart"/>
+      <w:r>
+        <w:rPr>
+          <w:color w:val="45B0E1" w:themeColor="accent1" w:themeTint="99"/>
+        </w:rPr>
+        <w:t>is</w:t>
+      </w:r>
+      <w:proofErr w:type="gramEnd"/>
+      <w:r>
+        <w:rPr>
+          <w:color w:val="45B0E1" w:themeColor="accent1" w:themeTint="99"/>
+        </w:rPr>
+        <w:t xml:space="preserve"> in place of education and conflict is akin to ability.</w:t>
+      </w:r>
+      <w:r>
+        <w:rPr>
+          <w:color w:val="45B0E1" w:themeColor="accent1" w:themeTint="99"/>
+        </w:rPr>
+        <w:t xml:space="preserve"> A valid proxy for conflict would be </w:t>
+      </w:r>
+      <w:proofErr w:type="gramStart"/>
+      <w:r>
+        <w:rPr>
+          <w:color w:val="45B0E1" w:themeColor="accent1" w:themeTint="99"/>
+        </w:rPr>
+        <w:t>battle</w:t>
+      </w:r>
+      <w:proofErr w:type="gramEnd"/>
+      <w:r>
+        <w:rPr>
+          <w:color w:val="45B0E1" w:themeColor="accent1" w:themeTint="99"/>
+        </w:rPr>
+        <w:t xml:space="preserve"> deaths </w:t>
+      </w:r>
+      <w:proofErr w:type="gramStart"/>
+      <w:r>
+        <w:rPr>
+          <w:color w:val="45B0E1" w:themeColor="accent1" w:themeTint="99"/>
+        </w:rPr>
+        <w:t>in a given</w:t>
+      </w:r>
+      <w:proofErr w:type="gramEnd"/>
+      <w:r>
+        <w:rPr>
+          <w:color w:val="45B0E1" w:themeColor="accent1" w:themeTint="99"/>
+        </w:rPr>
+        <w:t xml:space="preserve"> proximity to the household.</w:t>
       </w:r>
     </w:p>
     <w:p>
@@ -463,7 +849,21 @@
         <w:rPr>
           <w:color w:val="45B0E1" w:themeColor="accent1" w:themeTint="99"/>
         </w:rPr>
-        <w:t xml:space="preserve"> to use a food consumption dummy as a proxy variable as it </w:t>
+        <w:t xml:space="preserve"> </w:t>
+      </w:r>
+      <w:proofErr w:type="gramStart"/>
+      <w:r>
+        <w:rPr>
+          <w:color w:val="45B0E1" w:themeColor="accent1" w:themeTint="99"/>
+        </w:rPr>
+        <w:t>to use</w:t>
+      </w:r>
+      <w:proofErr w:type="gramEnd"/>
+      <w:r>
+        <w:rPr>
+          <w:color w:val="45B0E1" w:themeColor="accent1" w:themeTint="99"/>
+        </w:rPr>
+        <w:t xml:space="preserve"> a food consumption dummy as a proxy variable as it </w:t>
       </w:r>
       <w:r>
         <w:rPr>
@@ -481,7 +881,21 @@
         <w:rPr>
           <w:color w:val="45B0E1" w:themeColor="accent1" w:themeTint="99"/>
         </w:rPr>
-        <w:t xml:space="preserve"> the conditions required for a proxy variable to be valid. </w:t>
+        <w:t xml:space="preserve"> the conditions required for a </w:t>
+      </w:r>
+      <w:proofErr w:type="gramStart"/>
+      <w:r>
+        <w:rPr>
+          <w:color w:val="45B0E1" w:themeColor="accent1" w:themeTint="99"/>
+        </w:rPr>
+        <w:t>proxy variable</w:t>
+      </w:r>
+      <w:proofErr w:type="gramEnd"/>
+      <w:r>
+        <w:rPr>
+          <w:color w:val="45B0E1" w:themeColor="accent1" w:themeTint="99"/>
+        </w:rPr>
+        <w:t xml:space="preserve"> to be valid. </w:t>
       </w:r>
       <w:r>
         <w:rPr>
@@ -598,7 +1012,21 @@
         <w:rPr>
           <w:color w:val="45B0E1" w:themeColor="accent1" w:themeTint="99"/>
         </w:rPr>
-        <w:t xml:space="preserve">broader phenomen like </w:t>
+        <w:t xml:space="preserve">broader </w:t>
+      </w:r>
+      <w:proofErr w:type="spellStart"/>
+      <w:r>
+        <w:rPr>
+          <w:color w:val="45B0E1" w:themeColor="accent1" w:themeTint="99"/>
+        </w:rPr>
+        <w:t>phenomen</w:t>
+      </w:r>
+      <w:proofErr w:type="spellEnd"/>
+      <w:r>
+        <w:rPr>
+          <w:color w:val="45B0E1" w:themeColor="accent1" w:themeTint="99"/>
+        </w:rPr>
+        <w:t xml:space="preserve"> like </w:t>
       </w:r>
       <w:r>
         <w:rPr>
@@ -646,7 +1074,15 @@
     </w:p>
     <w:p>
       <w:r>
-        <w:t xml:space="preserve">Empirical evidence from multiple studies—such as Stifel and Christiaensen (2007), Christiaensen et al. (2012), Douidich et al. (2013), and Yoshida et al. (2022)—shows that S2S models can closely replicate direct survey-based poverty estimates. More recently, Dang et al. (2025) demonstrate that, even under a randomized experimental design, an S2S model trained on pre-pandemic data </w:t>
+        <w:t xml:space="preserve">Empirical evidence from multiple studies—such as Stifel and Christiaensen (2007), Christiaensen et al. (2012), </w:t>
+      </w:r>
+      <w:proofErr w:type="spellStart"/>
+      <w:r>
+        <w:t>Douidich</w:t>
+      </w:r>
+      <w:proofErr w:type="spellEnd"/>
+      <w:r>
+        <w:t xml:space="preserve"> et al. (2013), and Yoshida et al. (2022)—shows that S2S models can closely replicate direct survey-based poverty estimates. More recently, Dang et al. (2025) demonstrate that, even under a randomized experimental design, an S2S model trained on pre-pandemic data </w:t>
       </w:r>
       <w:r>
         <w:lastRenderedPageBreak/>
@@ -675,7 +1111,23 @@
     <w:p/>
     <w:p>
       <w:r>
-        <w:t>2. This paper suggests that S2S fails if the model stability is violated, but is this true? Even if one parameter changes over time, the changes in other parameters can offset it, and as a result, a model trained in one round of survey can predict poverty rates accurately in later rounds. An empirical assessment on this is shown in Yoshida et al. 2022 (Table 5). Even though the percentage of stable coefficients is less than 70 percent, the model can predict poverty rates well in the testing data. This does not reduce the value of the analysis in this paper, but it will be useful to add caveats when it discusses the relationship between the model stability and the accuracy of the S2S.</w:t>
+        <w:t xml:space="preserve">2. This paper suggests that S2S fails if the model stability is violated, but is this true? Even if one parameter changes over time, the changes in other parameters can offset it, and as a result, a model trained in one round of survey can predict poverty rates accurately in later rounds. An empirical assessment </w:t>
+      </w:r>
+      <w:proofErr w:type="gramStart"/>
+      <w:r>
+        <w:t>on</w:t>
+      </w:r>
+      <w:proofErr w:type="gramEnd"/>
+      <w:r>
+        <w:t xml:space="preserve"> this is shown in Yoshida et al. 2022 (Table 5). Even though the percentage of stable coefficients is less than 70 percent, the model can predict poverty rates well in the testing data. This does not reduce the value of the analysis in this paper, but it will be useful to add caveats when it discusses the relationship between the </w:t>
+      </w:r>
+      <w:proofErr w:type="gramStart"/>
+      <w:r>
+        <w:t>model stability</w:t>
+      </w:r>
+      <w:proofErr w:type="gramEnd"/>
+      <w:r>
+        <w:t xml:space="preserve"> and the accuracy of the S2S.</w:t>
       </w:r>
     </w:p>
     <w:p>
@@ -694,7 +1146,49 @@
         <w:rPr>
           <w:color w:val="45B0E1" w:themeColor="accent1" w:themeTint="99"/>
         </w:rPr>
-        <w:t xml:space="preserve">These studies fail to indicate how many models were fit until the right one was obtained. In upcoming work we highlight how these methods fail to predict changes in poverty in the Peru. The simulations presented here are useful to illustrate how easy it is for these methods to fail. </w:t>
+        <w:t xml:space="preserve">These studies fail to indicate how many models </w:t>
+      </w:r>
+      <w:proofErr w:type="gramStart"/>
+      <w:r>
+        <w:rPr>
+          <w:color w:val="45B0E1" w:themeColor="accent1" w:themeTint="99"/>
+        </w:rPr>
+        <w:t>were fit</w:t>
+      </w:r>
+      <w:proofErr w:type="gramEnd"/>
+      <w:r>
+        <w:rPr>
+          <w:color w:val="45B0E1" w:themeColor="accent1" w:themeTint="99"/>
+        </w:rPr>
+        <w:t xml:space="preserve"> until the right one was obtained. In upcoming </w:t>
+      </w:r>
+      <w:proofErr w:type="gramStart"/>
+      <w:r>
+        <w:rPr>
+          <w:color w:val="45B0E1" w:themeColor="accent1" w:themeTint="99"/>
+        </w:rPr>
+        <w:t>work</w:t>
+      </w:r>
+      <w:proofErr w:type="gramEnd"/>
+      <w:r>
+        <w:rPr>
+          <w:color w:val="45B0E1" w:themeColor="accent1" w:themeTint="99"/>
+        </w:rPr>
+        <w:t xml:space="preserve"> we highlight how these methods fail to predict changes in poverty in </w:t>
+      </w:r>
+      <w:proofErr w:type="gramStart"/>
+      <w:r>
+        <w:rPr>
+          <w:color w:val="45B0E1" w:themeColor="accent1" w:themeTint="99"/>
+        </w:rPr>
+        <w:t>the Peru</w:t>
+      </w:r>
+      <w:proofErr w:type="gramEnd"/>
+      <w:r>
+        <w:rPr>
+          <w:color w:val="45B0E1" w:themeColor="accent1" w:themeTint="99"/>
+        </w:rPr>
+        <w:t xml:space="preserve">. The simulations presented here are useful to illustrate how easy it is for these methods to fail. </w:t>
       </w:r>
     </w:p>
     <w:p/>
@@ -736,19 +1230,61 @@
         <w:rPr>
           <w:color w:val="45B0E1" w:themeColor="accent1" w:themeTint="99"/>
         </w:rPr>
-        <w:t>The MSE is estimated following standard statistical literature</w:t>
-      </w:r>
-      <w:r>
-        <w:rPr>
-          <w:color w:val="45B0E1" w:themeColor="accent1" w:themeTint="99"/>
-        </w:rPr>
-        <w:t>, and follows the assumed model</w:t>
-      </w:r>
-      <w:r>
-        <w:rPr>
-          <w:color w:val="45B0E1" w:themeColor="accent1" w:themeTint="99"/>
-        </w:rPr>
-        <w:t>. The parametric bootstrap yields an estimate of the MSE. What figure 8 illustrates is that in reality, the typical noise measure used in MI as well as the noise estimated via a parametric bootstrap yield an upward biased estimate of the noise, in this case noted by the empirical MSE.</w:t>
+        <w:t xml:space="preserve">The MSE is estimated </w:t>
+      </w:r>
+      <w:proofErr w:type="gramStart"/>
+      <w:r>
+        <w:rPr>
+          <w:color w:val="45B0E1" w:themeColor="accent1" w:themeTint="99"/>
+        </w:rPr>
+        <w:t>following</w:t>
+      </w:r>
+      <w:proofErr w:type="gramEnd"/>
+      <w:r>
+        <w:rPr>
+          <w:color w:val="45B0E1" w:themeColor="accent1" w:themeTint="99"/>
+        </w:rPr>
+        <w:t xml:space="preserve"> standard statistical </w:t>
+      </w:r>
+      <w:proofErr w:type="gramStart"/>
+      <w:r>
+        <w:rPr>
+          <w:color w:val="45B0E1" w:themeColor="accent1" w:themeTint="99"/>
+        </w:rPr>
+        <w:t>literature</w:t>
+      </w:r>
+      <w:r>
+        <w:rPr>
+          <w:color w:val="45B0E1" w:themeColor="accent1" w:themeTint="99"/>
+        </w:rPr>
+        <w:t>, and</w:t>
+      </w:r>
+      <w:proofErr w:type="gramEnd"/>
+      <w:r>
+        <w:rPr>
+          <w:color w:val="45B0E1" w:themeColor="accent1" w:themeTint="99"/>
+        </w:rPr>
+        <w:t xml:space="preserve"> follows the assumed model</w:t>
+      </w:r>
+      <w:r>
+        <w:rPr>
+          <w:color w:val="45B0E1" w:themeColor="accent1" w:themeTint="99"/>
+        </w:rPr>
+        <w:t xml:space="preserve">. The parametric bootstrap yields an estimate of the MSE. What figure 8 illustrates is </w:t>
+      </w:r>
+      <w:proofErr w:type="gramStart"/>
+      <w:r>
+        <w:rPr>
+          <w:color w:val="45B0E1" w:themeColor="accent1" w:themeTint="99"/>
+        </w:rPr>
+        <w:t>that in reality, the</w:t>
+      </w:r>
+      <w:proofErr w:type="gramEnd"/>
+      <w:r>
+        <w:rPr>
+          <w:color w:val="45B0E1" w:themeColor="accent1" w:themeTint="99"/>
+        </w:rPr>
+        <w:t xml:space="preserve"> typical noise measure used in MI as well as the noise estimated via a parametric bootstrap yield an upward biased estimate of the noise, in this case noted by the empirical MSE.</w:t>
       </w:r>
     </w:p>
     <w:p/>
@@ -817,7 +1353,15 @@
     <w:p/>
     <w:p>
       <w:r>
-        <w:t>Finally, MI and parametric bootstrap inherently differ because MI incorporates the uncertainty of coefficient and variance estimates, whereas the parametric bootstrap treats them as fixed. The latter is appropriate when OLS estimates are consistent and the sample is large, as parameter uncertainty vanishes asymptotically. When sample sizes are limited, however, the parametric bootstrap may underestimate total MSE. Hence, MI-based MSEs are expected to be larger, but this does not imply superiority of one approach over the other. Including a short theoretical discussion on the asymptotic and small-sample properties of MI and the parametric bootstrap would help readers interpret the simulation results more effectively.</w:t>
+        <w:t xml:space="preserve">Finally, MI and parametric </w:t>
+      </w:r>
+      <w:proofErr w:type="gramStart"/>
+      <w:r>
+        <w:t>bootstrap</w:t>
+      </w:r>
+      <w:proofErr w:type="gramEnd"/>
+      <w:r>
+        <w:t xml:space="preserve"> inherently differ because MI incorporates the uncertainty of coefficient and variance estimates, whereas the parametric bootstrap treats them as fixed. The latter is appropriate when OLS estimates are consistent and the sample is large, as parameter uncertainty vanishes asymptotically. When sample sizes are limited, however, the parametric bootstrap may underestimate total MSE. Hence, MI-based MSEs are expected to be larger, but this does not imply superiority of one approach over the other. Including a short theoretical discussion on the asymptotic and small-sample properties of MI and the parametric bootstrap would help readers interpret the simulation results more effectively.</w:t>
       </w:r>
     </w:p>
     <w:p>
@@ -857,17 +1401,47 @@
         </w:rPr>
         <w:t xml:space="preserve">. The survey’s betas are taken as the truth and are used to create multiple census data, where across the census data the only thing that varies </w:t>
       </w:r>
-      <w:r>
-        <w:rPr>
-          <w:color w:val="45B0E1" w:themeColor="accent1" w:themeTint="99"/>
-        </w:rPr>
-        <w:t xml:space="preserve">are the simulated errors, but these still come from the sigmas estimated in the survey. </w:t>
-      </w:r>
-      <w:r>
-        <w:rPr>
-          <w:color w:val="45B0E1" w:themeColor="accent1" w:themeTint="99"/>
-        </w:rPr>
-        <w:t>Thus across bootstrap replicates, the betas and distribution parameters vary.</w:t>
+      <w:proofErr w:type="gramStart"/>
+      <w:r>
+        <w:rPr>
+          <w:color w:val="45B0E1" w:themeColor="accent1" w:themeTint="99"/>
+        </w:rPr>
+        <w:t>are</w:t>
+      </w:r>
+      <w:proofErr w:type="gramEnd"/>
+      <w:r>
+        <w:rPr>
+          <w:color w:val="45B0E1" w:themeColor="accent1" w:themeTint="99"/>
+        </w:rPr>
+        <w:t xml:space="preserve"> the simulated errors, but these still come from the </w:t>
+      </w:r>
+      <w:proofErr w:type="spellStart"/>
+      <w:r>
+        <w:rPr>
+          <w:color w:val="45B0E1" w:themeColor="accent1" w:themeTint="99"/>
+        </w:rPr>
+        <w:t>sigmas</w:t>
+      </w:r>
+      <w:proofErr w:type="spellEnd"/>
+      <w:r>
+        <w:rPr>
+          <w:color w:val="45B0E1" w:themeColor="accent1" w:themeTint="99"/>
+        </w:rPr>
+        <w:t xml:space="preserve"> estimated in the survey. </w:t>
+      </w:r>
+      <w:proofErr w:type="gramStart"/>
+      <w:r>
+        <w:rPr>
+          <w:color w:val="45B0E1" w:themeColor="accent1" w:themeTint="99"/>
+        </w:rPr>
+        <w:t>Thus</w:t>
+      </w:r>
+      <w:proofErr w:type="gramEnd"/>
+      <w:r>
+        <w:rPr>
+          <w:color w:val="45B0E1" w:themeColor="accent1" w:themeTint="99"/>
+        </w:rPr>
+        <w:t xml:space="preserve"> across bootstrap replicates, the betas and distribution parameters vary.</w:t>
       </w:r>
     </w:p>
     <w:p>
@@ -876,7 +1450,63 @@
           <w:color w:val="45B0E1" w:themeColor="accent1" w:themeTint="99"/>
         </w:rPr>
         <w:lastRenderedPageBreak/>
-        <w:t xml:space="preserve">Across each of these censuses, the survey sample is extracted and the model is refit. This step leads to a variation in the parameters across each of the bootstrap estimates. Thus, the betas and sigmas across replicates vary. What the simulation undertaken in the paper is meant to show is how both methods actually lead to an overestimation of the imputation’s true MSE as approximated by the empirical MSE. We have clarified this further in the text. </w:t>
+        <w:t xml:space="preserve">Across each of these censuses, the survey sample is </w:t>
+      </w:r>
+      <w:proofErr w:type="gramStart"/>
+      <w:r>
+        <w:rPr>
+          <w:color w:val="45B0E1" w:themeColor="accent1" w:themeTint="99"/>
+        </w:rPr>
+        <w:t>extracted</w:t>
+      </w:r>
+      <w:proofErr w:type="gramEnd"/>
+      <w:r>
+        <w:rPr>
+          <w:color w:val="45B0E1" w:themeColor="accent1" w:themeTint="99"/>
+        </w:rPr>
+        <w:t xml:space="preserve"> and the model is </w:t>
+      </w:r>
+      <w:proofErr w:type="gramStart"/>
+      <w:r>
+        <w:rPr>
+          <w:color w:val="45B0E1" w:themeColor="accent1" w:themeTint="99"/>
+        </w:rPr>
+        <w:t>refit</w:t>
+      </w:r>
+      <w:proofErr w:type="gramEnd"/>
+      <w:r>
+        <w:rPr>
+          <w:color w:val="45B0E1" w:themeColor="accent1" w:themeTint="99"/>
+        </w:rPr>
+        <w:t xml:space="preserve">. This step leads to a variation in the parameters across each of the bootstrap estimates. Thus, the betas and </w:t>
+      </w:r>
+      <w:proofErr w:type="spellStart"/>
+      <w:r>
+        <w:rPr>
+          <w:color w:val="45B0E1" w:themeColor="accent1" w:themeTint="99"/>
+        </w:rPr>
+        <w:t>sigmas</w:t>
+      </w:r>
+      <w:proofErr w:type="spellEnd"/>
+      <w:r>
+        <w:rPr>
+          <w:color w:val="45B0E1" w:themeColor="accent1" w:themeTint="99"/>
+        </w:rPr>
+        <w:t xml:space="preserve"> across replicates vary. What the simulation undertaken in the paper is meant to show is how both methods </w:t>
+      </w:r>
+      <w:proofErr w:type="gramStart"/>
+      <w:r>
+        <w:rPr>
+          <w:color w:val="45B0E1" w:themeColor="accent1" w:themeTint="99"/>
+        </w:rPr>
+        <w:t>actually lead</w:t>
+      </w:r>
+      <w:proofErr w:type="gramEnd"/>
+      <w:r>
+        <w:rPr>
+          <w:color w:val="45B0E1" w:themeColor="accent1" w:themeTint="99"/>
+        </w:rPr>
+        <w:t xml:space="preserve"> to an overestimation of the imputation’s true MSE as approximated by the empirical MSE. We have clarified this further in the text. </w:t>
       </w:r>
     </w:p>
     <w:p>
@@ -899,7 +1529,21 @@
         <w:rPr>
           <w:color w:val="45B0E1" w:themeColor="accent1" w:themeTint="99"/>
         </w:rPr>
-        <w:t xml:space="preserve">This is accurate, and presents another reason as to why applying these methods over time is problematic and can lead to wrong predictions. </w:t>
+        <w:t xml:space="preserve">This is </w:t>
+      </w:r>
+      <w:proofErr w:type="gramStart"/>
+      <w:r>
+        <w:rPr>
+          <w:color w:val="45B0E1" w:themeColor="accent1" w:themeTint="99"/>
+        </w:rPr>
+        <w:t>accurate, and</w:t>
+      </w:r>
+      <w:proofErr w:type="gramEnd"/>
+      <w:r>
+        <w:rPr>
+          <w:color w:val="45B0E1" w:themeColor="accent1" w:themeTint="99"/>
+        </w:rPr>
+        <w:t xml:space="preserve"> presents another reason as to why applying these methods over time is problematic and can lead to wrong predictions. </w:t>
       </w:r>
       <w:r>
         <w:rPr>
@@ -917,7 +1561,15 @@
     <w:p/>
     <w:p>
       <w:r>
-        <w:t>Given this uncertainty, relying on empirical distribution might not always be the most robust choice. Since the normal distribution serves as an asymptotic approximation for many residual processes under standard regularity conditions, assuming normality could, in some cases, be a safer and more generalizable option. In other words, while using empirical residuals can improve fit within the same period, its validity across time depends critically on the stability of the error distribution—something that cannot be verified when welfare data are unavailable in the target survey. In this sense also, it will be useful to include some empirical assessments on this issue.</w:t>
+        <w:t xml:space="preserve">Given this uncertainty, relying on empirical distribution might not always be the most robust choice. Since the normal distribution serves as an asymptotic approximation for many residual processes under standard regularity conditions, assuming normality could, in some cases, be a safer and more generalizable option. In other words, while using empirical residuals can improve fit within the same period, its validity across time depends critically on the stability of the error </w:t>
+      </w:r>
+      <w:proofErr w:type="gramStart"/>
+      <w:r>
+        <w:t>distribution—</w:t>
+      </w:r>
+      <w:proofErr w:type="gramEnd"/>
+      <w:r>
+        <w:t>something that cannot be verified when welfare data are unavailable in the target survey. In this sense also, it will be useful to include some empirical assessments on this issue.</w:t>
       </w:r>
     </w:p>
     <w:p>

</xml_diff>

<commit_message>
Updates to draft and figures for WBER submission
</commit_message>
<xml_diff>
--- a/4.writeup/Reviewers.docx
+++ b/4.writeup/Reviewers.docx
@@ -393,20 +393,6 @@
         </w:rPr>
         <w:t>these</w:t>
       </w:r>
-      <w:r>
-        <w:rPr>
-          <w:color w:val="45B0E1" w:themeColor="accent1" w:themeTint="99"/>
-        </w:rPr>
-        <w:t xml:space="preserve"> </w:t>
-      </w:r>
-      <w:proofErr w:type="spellStart"/>
-      <w:r>
-        <w:rPr>
-          <w:color w:val="45B0E1" w:themeColor="accent1" w:themeTint="99"/>
-        </w:rPr>
-        <w:t>these</w:t>
-      </w:r>
-      <w:proofErr w:type="spellEnd"/>
       <w:proofErr w:type="gramEnd"/>
       <w:r>
         <w:rPr>
@@ -677,14 +663,9 @@
       <w:r>
         <w:t xml:space="preserve">For example, the simulation in Section 4.5.3—where the inclusion of egg consumption introduces bias in poverty estimates—raises the question of how common such scenarios are. In this setup, a </w:t>
       </w:r>
-      <w:proofErr w:type="gramStart"/>
       <w:r>
         <w:lastRenderedPageBreak/>
-        <w:t>positive</w:t>
-      </w:r>
-      <w:proofErr w:type="gramEnd"/>
-      <w:r>
-        <w:t xml:space="preserve"> shock improves household welfare (</w:t>
+        <w:t>positive shock improves household welfare (</w:t>
       </w:r>
       <w:proofErr w:type="gramStart"/>
       <w:r>
@@ -1450,21 +1431,7 @@
           <w:color w:val="45B0E1" w:themeColor="accent1" w:themeTint="99"/>
         </w:rPr>
         <w:lastRenderedPageBreak/>
-        <w:t xml:space="preserve">Across each of these censuses, the survey sample is </w:t>
-      </w:r>
-      <w:proofErr w:type="gramStart"/>
-      <w:r>
-        <w:rPr>
-          <w:color w:val="45B0E1" w:themeColor="accent1" w:themeTint="99"/>
-        </w:rPr>
-        <w:t>extracted</w:t>
-      </w:r>
-      <w:proofErr w:type="gramEnd"/>
-      <w:r>
-        <w:rPr>
-          <w:color w:val="45B0E1" w:themeColor="accent1" w:themeTint="99"/>
-        </w:rPr>
-        <w:t xml:space="preserve"> and the model is </w:t>
+        <w:t xml:space="preserve">Across each of these censuses, the survey sample is extracted and the model is </w:t>
       </w:r>
       <w:proofErr w:type="gramStart"/>
       <w:r>

</xml_diff>